<commit_message>
Updated 26-27 Ed-Fi ODS API Overview document for CTE.
</commit_message>
<xml_diff>
--- a/2026-27 MDE Ed-Fi Documentation/2026-2027 Ed-Fi ODS API Overview for SIS Vendors and Districts.docx
+++ b/2026-27 MDE Ed-Fi Documentation/2026-2027 Ed-Fi ODS API Overview for SIS Vendors and Districts.docx
@@ -123,7 +123,7 @@
             <w:t xml:space="preserve">Revision Date: </w:t>
           </w:r>
           <w:r>
-            <w:t>December</w:t>
+            <w:t>July</w:t>
           </w:r>
           <w:r>
             <w:t xml:space="preserve"> </w:t>
@@ -132,7 +132,10 @@
             <w:t>15</w:t>
           </w:r>
           <w:r>
-            <w:t>, 2025</w:t>
+            <w:t>, 202</w:t>
+          </w:r>
+          <w:r>
+            <w:t>6</w:t>
           </w:r>
         </w:p>
         <w:p>
@@ -164,7 +167,11 @@
             <w:rPr>
               <w:rFonts w:asciiTheme="minorHAnsi" w:eastAsiaTheme="minorEastAsia" w:hAnsiTheme="minorHAnsi" w:cstheme="minorBidi"/>
               <w:noProof/>
+              <w:kern w:val="2"/>
+              <w:sz w:val="24"/>
+              <w:szCs w:val="24"/>
               <w:lang w:bidi="ar-SA"/>
+              <w14:ligatures w14:val="standardContextual"/>
             </w:rPr>
           </w:pPr>
           <w:r>
@@ -176,7 +183,7 @@
           <w:r>
             <w:fldChar w:fldCharType="separate"/>
           </w:r>
-          <w:hyperlink w:anchor="_Toc206603656" w:history="1">
+          <w:hyperlink w:anchor="_Toc235006996" w:history="1">
             <w:r>
               <w:rPr>
                 <w:rStyle w:val="Hyperlink"/>
@@ -203,7 +210,7 @@
                 <w:noProof/>
                 <w:webHidden/>
               </w:rPr>
-              <w:instrText xml:space="preserve"> PAGEREF _Toc206603656 \h </w:instrText>
+              <w:instrText xml:space="preserve"> PAGEREF _Toc235006996 \h </w:instrText>
             </w:r>
             <w:r>
               <w:rPr>
@@ -243,10 +250,14 @@
             <w:rPr>
               <w:rFonts w:asciiTheme="minorHAnsi" w:eastAsiaTheme="minorEastAsia" w:hAnsiTheme="minorHAnsi" w:cstheme="minorBidi"/>
               <w:noProof/>
+              <w:kern w:val="2"/>
+              <w:sz w:val="24"/>
+              <w:szCs w:val="24"/>
               <w:lang w:bidi="ar-SA"/>
-            </w:rPr>
-          </w:pPr>
-          <w:hyperlink w:anchor="_Toc206603657" w:history="1">
+              <w14:ligatures w14:val="standardContextual"/>
+            </w:rPr>
+          </w:pPr>
+          <w:hyperlink w:anchor="_Toc235006997" w:history="1">
             <w:r>
               <w:rPr>
                 <w:rStyle w:val="Hyperlink"/>
@@ -273,7 +284,7 @@
                 <w:noProof/>
                 <w:webHidden/>
               </w:rPr>
-              <w:instrText xml:space="preserve"> PAGEREF _Toc206603657 \h </w:instrText>
+              <w:instrText xml:space="preserve"> PAGEREF _Toc235006997 \h </w:instrText>
             </w:r>
             <w:r>
               <w:rPr>
@@ -313,10 +324,14 @@
             <w:rPr>
               <w:rFonts w:asciiTheme="minorHAnsi" w:eastAsiaTheme="minorEastAsia" w:hAnsiTheme="minorHAnsi" w:cstheme="minorBidi"/>
               <w:noProof/>
+              <w:kern w:val="2"/>
+              <w:sz w:val="24"/>
+              <w:szCs w:val="24"/>
               <w:lang w:bidi="ar-SA"/>
-            </w:rPr>
-          </w:pPr>
-          <w:hyperlink w:anchor="_Toc206603658" w:history="1">
+              <w14:ligatures w14:val="standardContextual"/>
+            </w:rPr>
+          </w:pPr>
+          <w:hyperlink w:anchor="_Toc235006998" w:history="1">
             <w:r>
               <w:rPr>
                 <w:rStyle w:val="Hyperlink"/>
@@ -343,7 +358,7 @@
                 <w:noProof/>
                 <w:webHidden/>
               </w:rPr>
-              <w:instrText xml:space="preserve"> PAGEREF _Toc206603658 \h </w:instrText>
+              <w:instrText xml:space="preserve"> PAGEREF _Toc235006998 \h </w:instrText>
             </w:r>
             <w:r>
               <w:rPr>
@@ -383,10 +398,14 @@
             <w:rPr>
               <w:rFonts w:asciiTheme="minorHAnsi" w:eastAsiaTheme="minorEastAsia" w:hAnsiTheme="minorHAnsi" w:cstheme="minorBidi"/>
               <w:noProof/>
+              <w:kern w:val="2"/>
+              <w:sz w:val="24"/>
+              <w:szCs w:val="24"/>
               <w:lang w:bidi="ar-SA"/>
-            </w:rPr>
-          </w:pPr>
-          <w:hyperlink w:anchor="_Toc206603659" w:history="1">
+              <w14:ligatures w14:val="standardContextual"/>
+            </w:rPr>
+          </w:pPr>
+          <w:hyperlink w:anchor="_Toc235006999" w:history="1">
             <w:r>
               <w:rPr>
                 <w:rStyle w:val="Hyperlink"/>
@@ -413,7 +432,7 @@
                 <w:noProof/>
                 <w:webHidden/>
               </w:rPr>
-              <w:instrText xml:space="preserve"> PAGEREF _Toc206603659 \h </w:instrText>
+              <w:instrText xml:space="preserve"> PAGEREF _Toc235006999 \h </w:instrText>
             </w:r>
             <w:r>
               <w:rPr>
@@ -453,10 +472,14 @@
             <w:rPr>
               <w:rFonts w:asciiTheme="minorHAnsi" w:eastAsiaTheme="minorEastAsia" w:hAnsiTheme="minorHAnsi" w:cstheme="minorBidi"/>
               <w:noProof/>
+              <w:kern w:val="2"/>
+              <w:sz w:val="24"/>
+              <w:szCs w:val="24"/>
               <w:lang w:bidi="ar-SA"/>
-            </w:rPr>
-          </w:pPr>
-          <w:hyperlink w:anchor="_Toc206603660" w:history="1">
+              <w14:ligatures w14:val="standardContextual"/>
+            </w:rPr>
+          </w:pPr>
+          <w:hyperlink w:anchor="_Toc235007000" w:history="1">
             <w:r>
               <w:rPr>
                 <w:rStyle w:val="Hyperlink"/>
@@ -483,7 +506,7 @@
                 <w:noProof/>
                 <w:webHidden/>
               </w:rPr>
-              <w:instrText xml:space="preserve"> PAGEREF _Toc206603660 \h </w:instrText>
+              <w:instrText xml:space="preserve"> PAGEREF _Toc235007000 \h </w:instrText>
             </w:r>
             <w:r>
               <w:rPr>
@@ -523,10 +546,14 @@
             <w:rPr>
               <w:rFonts w:asciiTheme="minorHAnsi" w:eastAsiaTheme="minorEastAsia" w:hAnsiTheme="minorHAnsi" w:cstheme="minorBidi"/>
               <w:noProof/>
+              <w:kern w:val="2"/>
+              <w:sz w:val="24"/>
+              <w:szCs w:val="24"/>
               <w:lang w:bidi="ar-SA"/>
-            </w:rPr>
-          </w:pPr>
-          <w:hyperlink w:anchor="_Toc206603661" w:history="1">
+              <w14:ligatures w14:val="standardContextual"/>
+            </w:rPr>
+          </w:pPr>
+          <w:hyperlink w:anchor="_Toc235007001" w:history="1">
             <w:r>
               <w:rPr>
                 <w:rStyle w:val="Hyperlink"/>
@@ -553,7 +580,7 @@
                 <w:noProof/>
                 <w:webHidden/>
               </w:rPr>
-              <w:instrText xml:space="preserve"> PAGEREF _Toc206603661 \h </w:instrText>
+              <w:instrText xml:space="preserve"> PAGEREF _Toc235007001 \h </w:instrText>
             </w:r>
             <w:r>
               <w:rPr>
@@ -593,10 +620,14 @@
             <w:rPr>
               <w:rFonts w:asciiTheme="minorHAnsi" w:eastAsiaTheme="minorEastAsia" w:hAnsiTheme="minorHAnsi" w:cstheme="minorBidi"/>
               <w:noProof/>
+              <w:kern w:val="2"/>
+              <w:sz w:val="24"/>
+              <w:szCs w:val="24"/>
               <w:lang w:bidi="ar-SA"/>
-            </w:rPr>
-          </w:pPr>
-          <w:hyperlink w:anchor="_Toc206603662" w:history="1">
+              <w14:ligatures w14:val="standardContextual"/>
+            </w:rPr>
+          </w:pPr>
+          <w:hyperlink w:anchor="_Toc235007002" w:history="1">
             <w:r>
               <w:rPr>
                 <w:rStyle w:val="Hyperlink"/>
@@ -623,7 +654,7 @@
                 <w:noProof/>
                 <w:webHidden/>
               </w:rPr>
-              <w:instrText xml:space="preserve"> PAGEREF _Toc206603662 \h </w:instrText>
+              <w:instrText xml:space="preserve"> PAGEREF _Toc235007002 \h </w:instrText>
             </w:r>
             <w:r>
               <w:rPr>
@@ -663,10 +694,14 @@
             <w:rPr>
               <w:rFonts w:asciiTheme="minorHAnsi" w:eastAsiaTheme="minorEastAsia" w:hAnsiTheme="minorHAnsi" w:cstheme="minorBidi"/>
               <w:noProof/>
+              <w:kern w:val="2"/>
+              <w:sz w:val="24"/>
+              <w:szCs w:val="24"/>
               <w:lang w:bidi="ar-SA"/>
-            </w:rPr>
-          </w:pPr>
-          <w:hyperlink w:anchor="_Toc206603663" w:history="1">
+              <w14:ligatures w14:val="standardContextual"/>
+            </w:rPr>
+          </w:pPr>
+          <w:hyperlink w:anchor="_Toc235007003" w:history="1">
             <w:r>
               <w:rPr>
                 <w:rStyle w:val="Hyperlink"/>
@@ -693,7 +728,7 @@
                 <w:noProof/>
                 <w:webHidden/>
               </w:rPr>
-              <w:instrText xml:space="preserve"> PAGEREF _Toc206603663 \h </w:instrText>
+              <w:instrText xml:space="preserve"> PAGEREF _Toc235007003 \h </w:instrText>
             </w:r>
             <w:r>
               <w:rPr>
@@ -733,16 +768,20 @@
             <w:rPr>
               <w:rFonts w:asciiTheme="minorHAnsi" w:eastAsiaTheme="minorEastAsia" w:hAnsiTheme="minorHAnsi" w:cstheme="minorBidi"/>
               <w:noProof/>
+              <w:kern w:val="2"/>
+              <w:sz w:val="24"/>
+              <w:szCs w:val="24"/>
               <w:lang w:bidi="ar-SA"/>
-            </w:rPr>
-          </w:pPr>
-          <w:hyperlink w:anchor="_Toc206603664" w:history="1">
+              <w14:ligatures w14:val="standardContextual"/>
+            </w:rPr>
+          </w:pPr>
+          <w:hyperlink w:anchor="_Toc235007004" w:history="1">
             <w:r>
               <w:rPr>
                 <w:rStyle w:val="Hyperlink"/>
                 <w:noProof/>
               </w:rPr>
-              <w:t>Ed-Fi v6.2 API Reference for SY 2025-2026</w:t>
+              <w:t>Ed-Fi v6.2 API Reference for SY 2026-2027</w:t>
             </w:r>
             <w:r>
               <w:rPr>
@@ -763,7 +802,7 @@
                 <w:noProof/>
                 <w:webHidden/>
               </w:rPr>
-              <w:instrText xml:space="preserve"> PAGEREF _Toc206603664 \h </w:instrText>
+              <w:instrText xml:space="preserve"> PAGEREF _Toc235007004 \h </w:instrText>
             </w:r>
             <w:r>
               <w:rPr>
@@ -803,16 +842,20 @@
             <w:rPr>
               <w:rFonts w:asciiTheme="minorHAnsi" w:eastAsiaTheme="minorEastAsia" w:hAnsiTheme="minorHAnsi" w:cstheme="minorBidi"/>
               <w:noProof/>
+              <w:kern w:val="2"/>
+              <w:sz w:val="24"/>
+              <w:szCs w:val="24"/>
               <w:lang w:bidi="ar-SA"/>
-            </w:rPr>
-          </w:pPr>
-          <w:hyperlink w:anchor="_Toc206603665" w:history="1">
+              <w14:ligatures w14:val="standardContextual"/>
+            </w:rPr>
+          </w:pPr>
+          <w:hyperlink w:anchor="_Toc235007005" w:history="1">
             <w:r>
               <w:rPr>
                 <w:rStyle w:val="Hyperlink"/>
                 <w:noProof/>
               </w:rPr>
-              <w:t>Upgrade to Ed-Fi v6.2 for SY 2025-2026</w:t>
+              <w:t>Addition of CareerPathwayDescriptor to MCCC Course Data Collection for SY 2026-2027</w:t>
             </w:r>
             <w:r>
               <w:rPr>
@@ -833,7 +876,7 @@
                 <w:noProof/>
                 <w:webHidden/>
               </w:rPr>
-              <w:instrText xml:space="preserve"> PAGEREF _Toc206603665 \h </w:instrText>
+              <w:instrText xml:space="preserve"> PAGEREF _Toc235007005 \h </w:instrText>
             </w:r>
             <w:r>
               <w:rPr>
@@ -873,16 +916,20 @@
             <w:rPr>
               <w:rFonts w:asciiTheme="minorHAnsi" w:eastAsiaTheme="minorEastAsia" w:hAnsiTheme="minorHAnsi" w:cstheme="minorBidi"/>
               <w:noProof/>
+              <w:kern w:val="2"/>
+              <w:sz w:val="24"/>
+              <w:szCs w:val="24"/>
               <w:lang w:bidi="ar-SA"/>
-            </w:rPr>
-          </w:pPr>
-          <w:hyperlink w:anchor="_Toc206603666" w:history="1">
+              <w14:ligatures w14:val="standardContextual"/>
+            </w:rPr>
+          </w:pPr>
+          <w:hyperlink w:anchor="_Toc235007006" w:history="1">
             <w:r>
               <w:rPr>
                 <w:rStyle w:val="Hyperlink"/>
                 <w:noProof/>
               </w:rPr>
-              <w:t>Descriptor Changes for SY 2025-2026</w:t>
+              <w:t>Removal of Unneeded Data Collections for SY 2026-2027</w:t>
             </w:r>
             <w:r>
               <w:rPr>
@@ -903,7 +950,7 @@
                 <w:noProof/>
                 <w:webHidden/>
               </w:rPr>
-              <w:instrText xml:space="preserve"> PAGEREF _Toc206603666 \h </w:instrText>
+              <w:instrText xml:space="preserve"> PAGEREF _Toc235007006 \h </w:instrText>
             </w:r>
             <w:r>
               <w:rPr>
@@ -923,7 +970,7 @@
                 <w:noProof/>
                 <w:webHidden/>
               </w:rPr>
-              <w:t>6</w:t>
+              <w:t>5</w:t>
             </w:r>
             <w:r>
               <w:rPr>
@@ -943,10 +990,14 @@
             <w:rPr>
               <w:rFonts w:asciiTheme="minorHAnsi" w:eastAsiaTheme="minorEastAsia" w:hAnsiTheme="minorHAnsi" w:cstheme="minorBidi"/>
               <w:noProof/>
+              <w:kern w:val="2"/>
+              <w:sz w:val="24"/>
+              <w:szCs w:val="24"/>
               <w:lang w:bidi="ar-SA"/>
-            </w:rPr>
-          </w:pPr>
-          <w:hyperlink w:anchor="_Toc206603667" w:history="1">
+              <w14:ligatures w14:val="standardContextual"/>
+            </w:rPr>
+          </w:pPr>
+          <w:hyperlink w:anchor="_Toc235007007" w:history="1">
             <w:r>
               <w:rPr>
                 <w:rStyle w:val="Hyperlink"/>
@@ -973,7 +1024,7 @@
                 <w:noProof/>
                 <w:webHidden/>
               </w:rPr>
-              <w:instrText xml:space="preserve"> PAGEREF _Toc206603667 \h </w:instrText>
+              <w:instrText xml:space="preserve"> PAGEREF _Toc235007007 \h </w:instrText>
             </w:r>
             <w:r>
               <w:rPr>
@@ -1013,10 +1064,14 @@
             <w:rPr>
               <w:rFonts w:asciiTheme="minorHAnsi" w:eastAsiaTheme="minorEastAsia" w:hAnsiTheme="minorHAnsi" w:cstheme="minorBidi"/>
               <w:noProof/>
+              <w:kern w:val="2"/>
+              <w:sz w:val="24"/>
+              <w:szCs w:val="24"/>
               <w:lang w:bidi="ar-SA"/>
-            </w:rPr>
-          </w:pPr>
-          <w:hyperlink w:anchor="_Toc206603668" w:history="1">
+              <w14:ligatures w14:val="standardContextual"/>
+            </w:rPr>
+          </w:pPr>
+          <w:hyperlink w:anchor="_Toc235007008" w:history="1">
             <w:r>
               <w:rPr>
                 <w:rStyle w:val="Hyperlink"/>
@@ -1043,7 +1098,7 @@
                 <w:noProof/>
                 <w:webHidden/>
               </w:rPr>
-              <w:instrText xml:space="preserve"> PAGEREF _Toc206603668 \h </w:instrText>
+              <w:instrText xml:space="preserve"> PAGEREF _Toc235007008 \h </w:instrText>
             </w:r>
             <w:r>
               <w:rPr>
@@ -1083,10 +1138,14 @@
             <w:rPr>
               <w:rFonts w:asciiTheme="minorHAnsi" w:eastAsiaTheme="minorEastAsia" w:hAnsiTheme="minorHAnsi" w:cstheme="minorBidi"/>
               <w:noProof/>
+              <w:kern w:val="2"/>
+              <w:sz w:val="24"/>
+              <w:szCs w:val="24"/>
               <w:lang w:bidi="ar-SA"/>
-            </w:rPr>
-          </w:pPr>
-          <w:hyperlink w:anchor="_Toc206603669" w:history="1">
+              <w14:ligatures w14:val="standardContextual"/>
+            </w:rPr>
+          </w:pPr>
+          <w:hyperlink w:anchor="_Toc235007009" w:history="1">
             <w:r>
               <w:rPr>
                 <w:rStyle w:val="Hyperlink"/>
@@ -1113,7 +1172,7 @@
                 <w:noProof/>
                 <w:webHidden/>
               </w:rPr>
-              <w:instrText xml:space="preserve"> PAGEREF _Toc206603669 \h </w:instrText>
+              <w:instrText xml:space="preserve"> PAGEREF _Toc235007009 \h </w:instrText>
             </w:r>
             <w:r>
               <w:rPr>
@@ -1153,10 +1212,14 @@
             <w:rPr>
               <w:rFonts w:asciiTheme="minorHAnsi" w:eastAsiaTheme="minorEastAsia" w:hAnsiTheme="minorHAnsi" w:cstheme="minorBidi"/>
               <w:noProof/>
+              <w:kern w:val="2"/>
+              <w:sz w:val="24"/>
+              <w:szCs w:val="24"/>
               <w:lang w:bidi="ar-SA"/>
-            </w:rPr>
-          </w:pPr>
-          <w:hyperlink w:anchor="_Toc206603670" w:history="1">
+              <w14:ligatures w14:val="standardContextual"/>
+            </w:rPr>
+          </w:pPr>
+          <w:hyperlink w:anchor="_Toc235007010" w:history="1">
             <w:r>
               <w:rPr>
                 <w:rStyle w:val="Hyperlink"/>
@@ -1183,7 +1246,7 @@
                 <w:noProof/>
                 <w:webHidden/>
               </w:rPr>
-              <w:instrText xml:space="preserve"> PAGEREF _Toc206603670 \h </w:instrText>
+              <w:instrText xml:space="preserve"> PAGEREF _Toc235007010 \h </w:instrText>
             </w:r>
             <w:r>
               <w:rPr>
@@ -1223,10 +1286,14 @@
             <w:rPr>
               <w:rFonts w:asciiTheme="minorHAnsi" w:eastAsiaTheme="minorEastAsia" w:hAnsiTheme="minorHAnsi" w:cstheme="minorBidi"/>
               <w:noProof/>
+              <w:kern w:val="2"/>
+              <w:sz w:val="24"/>
+              <w:szCs w:val="24"/>
               <w:lang w:bidi="ar-SA"/>
-            </w:rPr>
-          </w:pPr>
-          <w:hyperlink w:anchor="_Toc206603671" w:history="1">
+              <w14:ligatures w14:val="standardContextual"/>
+            </w:rPr>
+          </w:pPr>
+          <w:hyperlink w:anchor="_Toc235007011" w:history="1">
             <w:r>
               <w:rPr>
                 <w:rStyle w:val="Hyperlink"/>
@@ -1253,7 +1320,7 @@
                 <w:noProof/>
                 <w:webHidden/>
               </w:rPr>
-              <w:instrText xml:space="preserve"> PAGEREF _Toc206603671 \h </w:instrText>
+              <w:instrText xml:space="preserve"> PAGEREF _Toc235007011 \h </w:instrText>
             </w:r>
             <w:r>
               <w:rPr>
@@ -1293,10 +1360,14 @@
             <w:rPr>
               <w:rFonts w:asciiTheme="minorHAnsi" w:eastAsiaTheme="minorEastAsia" w:hAnsiTheme="minorHAnsi" w:cstheme="minorBidi"/>
               <w:noProof/>
+              <w:kern w:val="2"/>
+              <w:sz w:val="24"/>
+              <w:szCs w:val="24"/>
               <w:lang w:bidi="ar-SA"/>
-            </w:rPr>
-          </w:pPr>
-          <w:hyperlink w:anchor="_Toc206603672" w:history="1">
+              <w14:ligatures w14:val="standardContextual"/>
+            </w:rPr>
+          </w:pPr>
+          <w:hyperlink w:anchor="_Toc235007012" w:history="1">
             <w:r>
               <w:rPr>
                 <w:rStyle w:val="Hyperlink"/>
@@ -1323,7 +1394,7 @@
                 <w:noProof/>
                 <w:webHidden/>
               </w:rPr>
-              <w:instrText xml:space="preserve"> PAGEREF _Toc206603672 \h </w:instrText>
+              <w:instrText xml:space="preserve"> PAGEREF _Toc235007012 \h </w:instrText>
             </w:r>
             <w:r>
               <w:rPr>
@@ -1363,10 +1434,14 @@
             <w:rPr>
               <w:rFonts w:asciiTheme="minorHAnsi" w:eastAsiaTheme="minorEastAsia" w:hAnsiTheme="minorHAnsi" w:cstheme="minorBidi"/>
               <w:noProof/>
+              <w:kern w:val="2"/>
+              <w:sz w:val="24"/>
+              <w:szCs w:val="24"/>
               <w:lang w:bidi="ar-SA"/>
-            </w:rPr>
-          </w:pPr>
-          <w:hyperlink w:anchor="_Toc206603673" w:history="1">
+              <w14:ligatures w14:val="standardContextual"/>
+            </w:rPr>
+          </w:pPr>
+          <w:hyperlink w:anchor="_Toc235007013" w:history="1">
             <w:r>
               <w:rPr>
                 <w:rStyle w:val="Hyperlink"/>
@@ -1393,7 +1468,7 @@
                 <w:noProof/>
                 <w:webHidden/>
               </w:rPr>
-              <w:instrText xml:space="preserve"> PAGEREF _Toc206603673 \h </w:instrText>
+              <w:instrText xml:space="preserve"> PAGEREF _Toc235007013 \h </w:instrText>
             </w:r>
             <w:r>
               <w:rPr>
@@ -1413,7 +1488,7 @@
                 <w:noProof/>
                 <w:webHidden/>
               </w:rPr>
-              <w:t>7</w:t>
+              <w:t>6</w:t>
             </w:r>
             <w:r>
               <w:rPr>
@@ -1433,10 +1508,14 @@
             <w:rPr>
               <w:rFonts w:asciiTheme="minorHAnsi" w:eastAsiaTheme="minorEastAsia" w:hAnsiTheme="minorHAnsi" w:cstheme="minorBidi"/>
               <w:noProof/>
+              <w:kern w:val="2"/>
+              <w:sz w:val="24"/>
+              <w:szCs w:val="24"/>
               <w:lang w:bidi="ar-SA"/>
-            </w:rPr>
-          </w:pPr>
-          <w:hyperlink w:anchor="_Toc206603674" w:history="1">
+              <w14:ligatures w14:val="standardContextual"/>
+            </w:rPr>
+          </w:pPr>
+          <w:hyperlink w:anchor="_Toc235007014" w:history="1">
             <w:r>
               <w:rPr>
                 <w:rStyle w:val="Hyperlink"/>
@@ -1463,7 +1542,7 @@
                 <w:noProof/>
                 <w:webHidden/>
               </w:rPr>
-              <w:instrText xml:space="preserve"> PAGEREF _Toc206603674 \h </w:instrText>
+              <w:instrText xml:space="preserve"> PAGEREF _Toc235007014 \h </w:instrText>
             </w:r>
             <w:r>
               <w:rPr>
@@ -1483,7 +1562,7 @@
                 <w:noProof/>
                 <w:webHidden/>
               </w:rPr>
-              <w:t>7</w:t>
+              <w:t>6</w:t>
             </w:r>
             <w:r>
               <w:rPr>
@@ -1503,10 +1582,14 @@
             <w:rPr>
               <w:rFonts w:asciiTheme="minorHAnsi" w:eastAsiaTheme="minorEastAsia" w:hAnsiTheme="minorHAnsi" w:cstheme="minorBidi"/>
               <w:noProof/>
+              <w:kern w:val="2"/>
+              <w:sz w:val="24"/>
+              <w:szCs w:val="24"/>
               <w:lang w:bidi="ar-SA"/>
-            </w:rPr>
-          </w:pPr>
-          <w:hyperlink w:anchor="_Toc206603675" w:history="1">
+              <w14:ligatures w14:val="standardContextual"/>
+            </w:rPr>
+          </w:pPr>
+          <w:hyperlink w:anchor="_Toc235007015" w:history="1">
             <w:r>
               <w:rPr>
                 <w:rStyle w:val="Hyperlink"/>
@@ -1533,7 +1616,7 @@
                 <w:noProof/>
                 <w:webHidden/>
               </w:rPr>
-              <w:instrText xml:space="preserve"> PAGEREF _Toc206603675 \h </w:instrText>
+              <w:instrText xml:space="preserve"> PAGEREF _Toc235007015 \h </w:instrText>
             </w:r>
             <w:r>
               <w:rPr>
@@ -1573,10 +1656,14 @@
             <w:rPr>
               <w:rFonts w:asciiTheme="minorHAnsi" w:eastAsiaTheme="minorEastAsia" w:hAnsiTheme="minorHAnsi" w:cstheme="minorBidi"/>
               <w:noProof/>
+              <w:kern w:val="2"/>
+              <w:sz w:val="24"/>
+              <w:szCs w:val="24"/>
               <w:lang w:bidi="ar-SA"/>
-            </w:rPr>
-          </w:pPr>
-          <w:hyperlink w:anchor="_Toc206603676" w:history="1">
+              <w14:ligatures w14:val="standardContextual"/>
+            </w:rPr>
+          </w:pPr>
+          <w:hyperlink w:anchor="_Toc235007016" w:history="1">
             <w:r>
               <w:rPr>
                 <w:rStyle w:val="Hyperlink"/>
@@ -1603,7 +1690,7 @@
                 <w:noProof/>
                 <w:webHidden/>
               </w:rPr>
-              <w:instrText xml:space="preserve"> PAGEREF _Toc206603676 \h </w:instrText>
+              <w:instrText xml:space="preserve"> PAGEREF _Toc235007016 \h </w:instrText>
             </w:r>
             <w:r>
               <w:rPr>
@@ -1643,10 +1730,14 @@
             <w:rPr>
               <w:rFonts w:asciiTheme="minorHAnsi" w:eastAsiaTheme="minorEastAsia" w:hAnsiTheme="minorHAnsi" w:cstheme="minorBidi"/>
               <w:noProof/>
+              <w:kern w:val="2"/>
+              <w:sz w:val="24"/>
+              <w:szCs w:val="24"/>
               <w:lang w:bidi="ar-SA"/>
-            </w:rPr>
-          </w:pPr>
-          <w:hyperlink w:anchor="_Toc206603677" w:history="1">
+              <w14:ligatures w14:val="standardContextual"/>
+            </w:rPr>
+          </w:pPr>
+          <w:hyperlink w:anchor="_Toc235007017" w:history="1">
             <w:r>
               <w:rPr>
                 <w:rStyle w:val="Hyperlink"/>
@@ -1673,7 +1764,7 @@
                 <w:noProof/>
                 <w:webHidden/>
               </w:rPr>
-              <w:instrText xml:space="preserve"> PAGEREF _Toc206603677 \h </w:instrText>
+              <w:instrText xml:space="preserve"> PAGEREF _Toc235007017 \h </w:instrText>
             </w:r>
             <w:r>
               <w:rPr>
@@ -1713,10 +1804,14 @@
             <w:rPr>
               <w:rFonts w:asciiTheme="minorHAnsi" w:eastAsiaTheme="minorEastAsia" w:hAnsiTheme="minorHAnsi" w:cstheme="minorBidi"/>
               <w:noProof/>
+              <w:kern w:val="2"/>
+              <w:sz w:val="24"/>
+              <w:szCs w:val="24"/>
               <w:lang w:bidi="ar-SA"/>
-            </w:rPr>
-          </w:pPr>
-          <w:hyperlink w:anchor="_Toc206603678" w:history="1">
+              <w14:ligatures w14:val="standardContextual"/>
+            </w:rPr>
+          </w:pPr>
+          <w:hyperlink w:anchor="_Toc235007018" w:history="1">
             <w:r>
               <w:rPr>
                 <w:rStyle w:val="Hyperlink"/>
@@ -1743,7 +1838,7 @@
                 <w:noProof/>
                 <w:webHidden/>
               </w:rPr>
-              <w:instrText xml:space="preserve"> PAGEREF _Toc206603678 \h </w:instrText>
+              <w:instrText xml:space="preserve"> PAGEREF _Toc235007018 \h </w:instrText>
             </w:r>
             <w:r>
               <w:rPr>
@@ -1783,10 +1878,14 @@
             <w:rPr>
               <w:rFonts w:asciiTheme="minorHAnsi" w:eastAsiaTheme="minorEastAsia" w:hAnsiTheme="minorHAnsi" w:cstheme="minorBidi"/>
               <w:noProof/>
+              <w:kern w:val="2"/>
+              <w:sz w:val="24"/>
+              <w:szCs w:val="24"/>
               <w:lang w:bidi="ar-SA"/>
-            </w:rPr>
-          </w:pPr>
-          <w:hyperlink w:anchor="_Toc206603679" w:history="1">
+              <w14:ligatures w14:val="standardContextual"/>
+            </w:rPr>
+          </w:pPr>
+          <w:hyperlink w:anchor="_Toc235007019" w:history="1">
             <w:r>
               <w:rPr>
                 <w:rStyle w:val="Hyperlink"/>
@@ -1813,7 +1912,7 @@
                 <w:noProof/>
                 <w:webHidden/>
               </w:rPr>
-              <w:instrText xml:space="preserve"> PAGEREF _Toc206603679 \h </w:instrText>
+              <w:instrText xml:space="preserve"> PAGEREF _Toc235007019 \h </w:instrText>
             </w:r>
             <w:r>
               <w:rPr>
@@ -1853,10 +1952,14 @@
             <w:rPr>
               <w:rFonts w:asciiTheme="minorHAnsi" w:eastAsiaTheme="minorEastAsia" w:hAnsiTheme="minorHAnsi" w:cstheme="minorBidi"/>
               <w:noProof/>
+              <w:kern w:val="2"/>
+              <w:sz w:val="24"/>
+              <w:szCs w:val="24"/>
               <w:lang w:bidi="ar-SA"/>
-            </w:rPr>
-          </w:pPr>
-          <w:hyperlink w:anchor="_Toc206603680" w:history="1">
+              <w14:ligatures w14:val="standardContextual"/>
+            </w:rPr>
+          </w:pPr>
+          <w:hyperlink w:anchor="_Toc235007020" w:history="1">
             <w:r>
               <w:rPr>
                 <w:rStyle w:val="Hyperlink"/>
@@ -1883,7 +1986,7 @@
                 <w:noProof/>
                 <w:webHidden/>
               </w:rPr>
-              <w:instrText xml:space="preserve"> PAGEREF _Toc206603680 \h </w:instrText>
+              <w:instrText xml:space="preserve"> PAGEREF _Toc235007020 \h </w:instrText>
             </w:r>
             <w:r>
               <w:rPr>
@@ -1903,7 +2006,7 @@
                 <w:noProof/>
                 <w:webHidden/>
               </w:rPr>
-              <w:t>8</w:t>
+              <w:t>7</w:t>
             </w:r>
             <w:r>
               <w:rPr>
@@ -1923,10 +2026,14 @@
             <w:rPr>
               <w:rFonts w:asciiTheme="minorHAnsi" w:eastAsiaTheme="minorEastAsia" w:hAnsiTheme="minorHAnsi" w:cstheme="minorBidi"/>
               <w:noProof/>
+              <w:kern w:val="2"/>
+              <w:sz w:val="24"/>
+              <w:szCs w:val="24"/>
               <w:lang w:bidi="ar-SA"/>
-            </w:rPr>
-          </w:pPr>
-          <w:hyperlink w:anchor="_Toc206603681" w:history="1">
+              <w14:ligatures w14:val="standardContextual"/>
+            </w:rPr>
+          </w:pPr>
+          <w:hyperlink w:anchor="_Toc235007021" w:history="1">
             <w:r>
               <w:rPr>
                 <w:rStyle w:val="Hyperlink"/>
@@ -1953,7 +2060,7 @@
                 <w:noProof/>
                 <w:webHidden/>
               </w:rPr>
-              <w:instrText xml:space="preserve"> PAGEREF _Toc206603681 \h </w:instrText>
+              <w:instrText xml:space="preserve"> PAGEREF _Toc235007021 \h </w:instrText>
             </w:r>
             <w:r>
               <w:rPr>
@@ -1993,10 +2100,14 @@
             <w:rPr>
               <w:rFonts w:asciiTheme="minorHAnsi" w:eastAsiaTheme="minorEastAsia" w:hAnsiTheme="minorHAnsi" w:cstheme="minorBidi"/>
               <w:noProof/>
+              <w:kern w:val="2"/>
+              <w:sz w:val="24"/>
+              <w:szCs w:val="24"/>
               <w:lang w:bidi="ar-SA"/>
-            </w:rPr>
-          </w:pPr>
-          <w:hyperlink w:anchor="_Toc206603682" w:history="1">
+              <w14:ligatures w14:val="standardContextual"/>
+            </w:rPr>
+          </w:pPr>
+          <w:hyperlink w:anchor="_Toc235007022" w:history="1">
             <w:r>
               <w:rPr>
                 <w:rStyle w:val="Hyperlink"/>
@@ -2023,7 +2134,7 @@
                 <w:noProof/>
                 <w:webHidden/>
               </w:rPr>
-              <w:instrText xml:space="preserve"> PAGEREF _Toc206603682 \h </w:instrText>
+              <w:instrText xml:space="preserve"> PAGEREF _Toc235007022 \h </w:instrText>
             </w:r>
             <w:r>
               <w:rPr>
@@ -2063,10 +2174,14 @@
             <w:rPr>
               <w:rFonts w:asciiTheme="minorHAnsi" w:eastAsiaTheme="minorEastAsia" w:hAnsiTheme="minorHAnsi" w:cstheme="minorBidi"/>
               <w:noProof/>
+              <w:kern w:val="2"/>
+              <w:sz w:val="24"/>
+              <w:szCs w:val="24"/>
               <w:lang w:bidi="ar-SA"/>
-            </w:rPr>
-          </w:pPr>
-          <w:hyperlink w:anchor="_Toc206603683" w:history="1">
+              <w14:ligatures w14:val="standardContextual"/>
+            </w:rPr>
+          </w:pPr>
+          <w:hyperlink w:anchor="_Toc235007023" w:history="1">
             <w:r>
               <w:rPr>
                 <w:rStyle w:val="Hyperlink"/>
@@ -2093,7 +2208,7 @@
                 <w:noProof/>
                 <w:webHidden/>
               </w:rPr>
-              <w:instrText xml:space="preserve"> PAGEREF _Toc206603683 \h </w:instrText>
+              <w:instrText xml:space="preserve"> PAGEREF _Toc235007023 \h </w:instrText>
             </w:r>
             <w:r>
               <w:rPr>
@@ -2113,7 +2228,7 @@
                 <w:noProof/>
                 <w:webHidden/>
               </w:rPr>
-              <w:t>9</w:t>
+              <w:t>8</w:t>
             </w:r>
             <w:r>
               <w:rPr>
@@ -2133,10 +2248,14 @@
             <w:rPr>
               <w:rFonts w:asciiTheme="minorHAnsi" w:eastAsiaTheme="minorEastAsia" w:hAnsiTheme="minorHAnsi" w:cstheme="minorBidi"/>
               <w:noProof/>
+              <w:kern w:val="2"/>
+              <w:sz w:val="24"/>
+              <w:szCs w:val="24"/>
               <w:lang w:bidi="ar-SA"/>
-            </w:rPr>
-          </w:pPr>
-          <w:hyperlink w:anchor="_Toc206603684" w:history="1">
+              <w14:ligatures w14:val="standardContextual"/>
+            </w:rPr>
+          </w:pPr>
+          <w:hyperlink w:anchor="_Toc235007024" w:history="1">
             <w:r>
               <w:rPr>
                 <w:rStyle w:val="Hyperlink"/>
@@ -2163,7 +2282,7 @@
                 <w:noProof/>
                 <w:webHidden/>
               </w:rPr>
-              <w:instrText xml:space="preserve"> PAGEREF _Toc206603684 \h </w:instrText>
+              <w:instrText xml:space="preserve"> PAGEREF _Toc235007024 \h </w:instrText>
             </w:r>
             <w:r>
               <w:rPr>
@@ -2203,10 +2322,14 @@
             <w:rPr>
               <w:rFonts w:asciiTheme="minorHAnsi" w:eastAsiaTheme="minorEastAsia" w:hAnsiTheme="minorHAnsi" w:cstheme="minorBidi"/>
               <w:noProof/>
+              <w:kern w:val="2"/>
+              <w:sz w:val="24"/>
+              <w:szCs w:val="24"/>
               <w:lang w:bidi="ar-SA"/>
-            </w:rPr>
-          </w:pPr>
-          <w:hyperlink w:anchor="_Toc206603685" w:history="1">
+              <w14:ligatures w14:val="standardContextual"/>
+            </w:rPr>
+          </w:pPr>
+          <w:hyperlink w:anchor="_Toc235007025" w:history="1">
             <w:r>
               <w:rPr>
                 <w:rStyle w:val="Hyperlink"/>
@@ -2233,7 +2356,7 @@
                 <w:noProof/>
                 <w:webHidden/>
               </w:rPr>
-              <w:instrText xml:space="preserve"> PAGEREF _Toc206603685 \h </w:instrText>
+              <w:instrText xml:space="preserve"> PAGEREF _Toc235007025 \h </w:instrText>
             </w:r>
             <w:r>
               <w:rPr>
@@ -2273,10 +2396,14 @@
             <w:rPr>
               <w:rFonts w:asciiTheme="minorHAnsi" w:eastAsiaTheme="minorEastAsia" w:hAnsiTheme="minorHAnsi" w:cstheme="minorBidi"/>
               <w:noProof/>
+              <w:kern w:val="2"/>
+              <w:sz w:val="24"/>
+              <w:szCs w:val="24"/>
               <w:lang w:bidi="ar-SA"/>
-            </w:rPr>
-          </w:pPr>
-          <w:hyperlink w:anchor="_Toc206603686" w:history="1">
+              <w14:ligatures w14:val="standardContextual"/>
+            </w:rPr>
+          </w:pPr>
+          <w:hyperlink w:anchor="_Toc235007026" w:history="1">
             <w:r>
               <w:rPr>
                 <w:rStyle w:val="Hyperlink"/>
@@ -2304,7 +2431,7 @@
                 <w:noProof/>
                 <w:webHidden/>
               </w:rPr>
-              <w:instrText xml:space="preserve"> PAGEREF _Toc206603686 \h </w:instrText>
+              <w:instrText xml:space="preserve"> PAGEREF _Toc235007026 \h </w:instrText>
             </w:r>
             <w:r>
               <w:rPr>
@@ -2344,10 +2471,14 @@
             <w:rPr>
               <w:rFonts w:asciiTheme="minorHAnsi" w:eastAsiaTheme="minorEastAsia" w:hAnsiTheme="minorHAnsi" w:cstheme="minorBidi"/>
               <w:noProof/>
+              <w:kern w:val="2"/>
+              <w:sz w:val="24"/>
+              <w:szCs w:val="24"/>
               <w:lang w:bidi="ar-SA"/>
-            </w:rPr>
-          </w:pPr>
-          <w:hyperlink w:anchor="_Toc206603687" w:history="1">
+              <w14:ligatures w14:val="standardContextual"/>
+            </w:rPr>
+          </w:pPr>
+          <w:hyperlink w:anchor="_Toc235007027" w:history="1">
             <w:r>
               <w:rPr>
                 <w:rStyle w:val="Hyperlink"/>
@@ -2375,7 +2506,7 @@
                 <w:noProof/>
                 <w:webHidden/>
               </w:rPr>
-              <w:instrText xml:space="preserve"> PAGEREF _Toc206603687 \h </w:instrText>
+              <w:instrText xml:space="preserve"> PAGEREF _Toc235007027 \h </w:instrText>
             </w:r>
             <w:r>
               <w:rPr>
@@ -2395,7 +2526,7 @@
                 <w:noProof/>
                 <w:webHidden/>
               </w:rPr>
-              <w:t>12</w:t>
+              <w:t>11</w:t>
             </w:r>
             <w:r>
               <w:rPr>
@@ -2415,10 +2546,14 @@
             <w:rPr>
               <w:rFonts w:asciiTheme="minorHAnsi" w:eastAsiaTheme="minorEastAsia" w:hAnsiTheme="minorHAnsi" w:cstheme="minorBidi"/>
               <w:noProof/>
+              <w:kern w:val="2"/>
+              <w:sz w:val="24"/>
+              <w:szCs w:val="24"/>
               <w:lang w:bidi="ar-SA"/>
-            </w:rPr>
-          </w:pPr>
-          <w:hyperlink w:anchor="_Toc206603688" w:history="1">
+              <w14:ligatures w14:val="standardContextual"/>
+            </w:rPr>
+          </w:pPr>
+          <w:hyperlink w:anchor="_Toc235007028" w:history="1">
             <w:r>
               <w:rPr>
                 <w:rStyle w:val="Hyperlink"/>
@@ -2445,7 +2580,7 @@
                 <w:noProof/>
                 <w:webHidden/>
               </w:rPr>
-              <w:instrText xml:space="preserve"> PAGEREF _Toc206603688 \h </w:instrText>
+              <w:instrText xml:space="preserve"> PAGEREF _Toc235007028 \h </w:instrText>
             </w:r>
             <w:r>
               <w:rPr>
@@ -2465,7 +2600,7 @@
                 <w:noProof/>
                 <w:webHidden/>
               </w:rPr>
-              <w:t>12</w:t>
+              <w:t>11</w:t>
             </w:r>
             <w:r>
               <w:rPr>
@@ -2485,10 +2620,14 @@
             <w:rPr>
               <w:rFonts w:asciiTheme="minorHAnsi" w:eastAsiaTheme="minorEastAsia" w:hAnsiTheme="minorHAnsi" w:cstheme="minorBidi"/>
               <w:noProof/>
+              <w:kern w:val="2"/>
+              <w:sz w:val="24"/>
+              <w:szCs w:val="24"/>
               <w:lang w:bidi="ar-SA"/>
-            </w:rPr>
-          </w:pPr>
-          <w:hyperlink w:anchor="_Toc206603689" w:history="1">
+              <w14:ligatures w14:val="standardContextual"/>
+            </w:rPr>
+          </w:pPr>
+          <w:hyperlink w:anchor="_Toc235007029" w:history="1">
             <w:r>
               <w:rPr>
                 <w:rStyle w:val="Hyperlink"/>
@@ -2515,7 +2654,7 @@
                 <w:noProof/>
                 <w:webHidden/>
               </w:rPr>
-              <w:instrText xml:space="preserve"> PAGEREF _Toc206603689 \h </w:instrText>
+              <w:instrText xml:space="preserve"> PAGEREF _Toc235007029 \h </w:instrText>
             </w:r>
             <w:r>
               <w:rPr>
@@ -2535,7 +2674,7 @@
                 <w:noProof/>
                 <w:webHidden/>
               </w:rPr>
-              <w:t>13</w:t>
+              <w:t>12</w:t>
             </w:r>
             <w:r>
               <w:rPr>
@@ -2555,10 +2694,14 @@
             <w:rPr>
               <w:rFonts w:asciiTheme="minorHAnsi" w:eastAsiaTheme="minorEastAsia" w:hAnsiTheme="minorHAnsi" w:cstheme="minorBidi"/>
               <w:noProof/>
+              <w:kern w:val="2"/>
+              <w:sz w:val="24"/>
+              <w:szCs w:val="24"/>
               <w:lang w:bidi="ar-SA"/>
-            </w:rPr>
-          </w:pPr>
-          <w:hyperlink w:anchor="_Toc206603690" w:history="1">
+              <w14:ligatures w14:val="standardContextual"/>
+            </w:rPr>
+          </w:pPr>
+          <w:hyperlink w:anchor="_Toc235007030" w:history="1">
             <w:r>
               <w:rPr>
                 <w:rStyle w:val="Hyperlink"/>
@@ -2585,7 +2728,7 @@
                 <w:noProof/>
                 <w:webHidden/>
               </w:rPr>
-              <w:instrText xml:space="preserve"> PAGEREF _Toc206603690 \h </w:instrText>
+              <w:instrText xml:space="preserve"> PAGEREF _Toc235007030 \h </w:instrText>
             </w:r>
             <w:r>
               <w:rPr>
@@ -2605,7 +2748,7 @@
                 <w:noProof/>
                 <w:webHidden/>
               </w:rPr>
-              <w:t>14</w:t>
+              <w:t>13</w:t>
             </w:r>
             <w:r>
               <w:rPr>
@@ -2625,10 +2768,14 @@
             <w:rPr>
               <w:rFonts w:asciiTheme="minorHAnsi" w:eastAsiaTheme="minorEastAsia" w:hAnsiTheme="minorHAnsi" w:cstheme="minorBidi"/>
               <w:noProof/>
+              <w:kern w:val="2"/>
+              <w:sz w:val="24"/>
+              <w:szCs w:val="24"/>
               <w:lang w:bidi="ar-SA"/>
-            </w:rPr>
-          </w:pPr>
-          <w:hyperlink w:anchor="_Toc206603691" w:history="1">
+              <w14:ligatures w14:val="standardContextual"/>
+            </w:rPr>
+          </w:pPr>
+          <w:hyperlink w:anchor="_Toc235007031" w:history="1">
             <w:r>
               <w:rPr>
                 <w:rStyle w:val="Hyperlink"/>
@@ -2655,7 +2802,7 @@
                 <w:noProof/>
                 <w:webHidden/>
               </w:rPr>
-              <w:instrText xml:space="preserve"> PAGEREF _Toc206603691 \h </w:instrText>
+              <w:instrText xml:space="preserve"> PAGEREF _Toc235007031 \h </w:instrText>
             </w:r>
             <w:r>
               <w:rPr>
@@ -2675,7 +2822,7 @@
                 <w:noProof/>
                 <w:webHidden/>
               </w:rPr>
-              <w:t>14</w:t>
+              <w:t>13</w:t>
             </w:r>
             <w:r>
               <w:rPr>
@@ -2695,10 +2842,14 @@
             <w:rPr>
               <w:rFonts w:asciiTheme="minorHAnsi" w:eastAsiaTheme="minorEastAsia" w:hAnsiTheme="minorHAnsi" w:cstheme="minorBidi"/>
               <w:noProof/>
+              <w:kern w:val="2"/>
+              <w:sz w:val="24"/>
+              <w:szCs w:val="24"/>
               <w:lang w:bidi="ar-SA"/>
-            </w:rPr>
-          </w:pPr>
-          <w:hyperlink w:anchor="_Toc206603692" w:history="1">
+              <w14:ligatures w14:val="standardContextual"/>
+            </w:rPr>
+          </w:pPr>
+          <w:hyperlink w:anchor="_Toc235007032" w:history="1">
             <w:r>
               <w:rPr>
                 <w:rStyle w:val="Hyperlink"/>
@@ -2725,7 +2876,7 @@
                 <w:noProof/>
                 <w:webHidden/>
               </w:rPr>
-              <w:instrText xml:space="preserve"> PAGEREF _Toc206603692 \h </w:instrText>
+              <w:instrText xml:space="preserve"> PAGEREF _Toc235007032 \h </w:instrText>
             </w:r>
             <w:r>
               <w:rPr>
@@ -2745,7 +2896,7 @@
                 <w:noProof/>
                 <w:webHidden/>
               </w:rPr>
-              <w:t>14</w:t>
+              <w:t>13</w:t>
             </w:r>
             <w:r>
               <w:rPr>
@@ -2765,10 +2916,14 @@
             <w:rPr>
               <w:rFonts w:asciiTheme="minorHAnsi" w:eastAsiaTheme="minorEastAsia" w:hAnsiTheme="minorHAnsi" w:cstheme="minorBidi"/>
               <w:noProof/>
+              <w:kern w:val="2"/>
+              <w:sz w:val="24"/>
+              <w:szCs w:val="24"/>
               <w:lang w:bidi="ar-SA"/>
-            </w:rPr>
-          </w:pPr>
-          <w:hyperlink w:anchor="_Toc206603693" w:history="1">
+              <w14:ligatures w14:val="standardContextual"/>
+            </w:rPr>
+          </w:pPr>
+          <w:hyperlink w:anchor="_Toc235007033" w:history="1">
             <w:r>
               <w:rPr>
                 <w:rStyle w:val="Hyperlink"/>
@@ -2795,7 +2950,7 @@
                 <w:noProof/>
                 <w:webHidden/>
               </w:rPr>
-              <w:instrText xml:space="preserve"> PAGEREF _Toc206603693 \h </w:instrText>
+              <w:instrText xml:space="preserve"> PAGEREF _Toc235007033 \h </w:instrText>
             </w:r>
             <w:r>
               <w:rPr>
@@ -2815,7 +2970,7 @@
                 <w:noProof/>
                 <w:webHidden/>
               </w:rPr>
-              <w:t>14</w:t>
+              <w:t>13</w:t>
             </w:r>
             <w:r>
               <w:rPr>
@@ -2835,10 +2990,14 @@
             <w:rPr>
               <w:rFonts w:asciiTheme="minorHAnsi" w:eastAsiaTheme="minorEastAsia" w:hAnsiTheme="minorHAnsi" w:cstheme="minorBidi"/>
               <w:noProof/>
+              <w:kern w:val="2"/>
+              <w:sz w:val="24"/>
+              <w:szCs w:val="24"/>
               <w:lang w:bidi="ar-SA"/>
-            </w:rPr>
-          </w:pPr>
-          <w:hyperlink w:anchor="_Toc206603694" w:history="1">
+              <w14:ligatures w14:val="standardContextual"/>
+            </w:rPr>
+          </w:pPr>
+          <w:hyperlink w:anchor="_Toc235007034" w:history="1">
             <w:r>
               <w:rPr>
                 <w:rStyle w:val="Hyperlink"/>
@@ -2865,7 +3024,7 @@
                 <w:noProof/>
                 <w:webHidden/>
               </w:rPr>
-              <w:instrText xml:space="preserve"> PAGEREF _Toc206603694 \h </w:instrText>
+              <w:instrText xml:space="preserve"> PAGEREF _Toc235007034 \h </w:instrText>
             </w:r>
             <w:r>
               <w:rPr>
@@ -2885,7 +3044,7 @@
                 <w:noProof/>
                 <w:webHidden/>
               </w:rPr>
-              <w:t>14</w:t>
+              <w:t>13</w:t>
             </w:r>
             <w:r>
               <w:rPr>
@@ -2905,10 +3064,14 @@
             <w:rPr>
               <w:rFonts w:asciiTheme="minorHAnsi" w:eastAsiaTheme="minorEastAsia" w:hAnsiTheme="minorHAnsi" w:cstheme="minorBidi"/>
               <w:noProof/>
+              <w:kern w:val="2"/>
+              <w:sz w:val="24"/>
+              <w:szCs w:val="24"/>
               <w:lang w:bidi="ar-SA"/>
-            </w:rPr>
-          </w:pPr>
-          <w:hyperlink w:anchor="_Toc206603695" w:history="1">
+              <w14:ligatures w14:val="standardContextual"/>
+            </w:rPr>
+          </w:pPr>
+          <w:hyperlink w:anchor="_Toc235007035" w:history="1">
             <w:r>
               <w:rPr>
                 <w:rStyle w:val="Hyperlink"/>
@@ -2935,7 +3098,7 @@
                 <w:noProof/>
                 <w:webHidden/>
               </w:rPr>
-              <w:instrText xml:space="preserve"> PAGEREF _Toc206603695 \h </w:instrText>
+              <w:instrText xml:space="preserve"> PAGEREF _Toc235007035 \h </w:instrText>
             </w:r>
             <w:r>
               <w:rPr>
@@ -2955,7 +3118,7 @@
                 <w:noProof/>
                 <w:webHidden/>
               </w:rPr>
-              <w:t>15</w:t>
+              <w:t>14</w:t>
             </w:r>
             <w:r>
               <w:rPr>
@@ -2975,10 +3138,14 @@
             <w:rPr>
               <w:rFonts w:asciiTheme="minorHAnsi" w:eastAsiaTheme="minorEastAsia" w:hAnsiTheme="minorHAnsi" w:cstheme="minorBidi"/>
               <w:noProof/>
+              <w:kern w:val="2"/>
+              <w:sz w:val="24"/>
+              <w:szCs w:val="24"/>
               <w:lang w:bidi="ar-SA"/>
-            </w:rPr>
-          </w:pPr>
-          <w:hyperlink w:anchor="_Toc206603696" w:history="1">
+              <w14:ligatures w14:val="standardContextual"/>
+            </w:rPr>
+          </w:pPr>
+          <w:hyperlink w:anchor="_Toc235007036" w:history="1">
             <w:r>
               <w:rPr>
                 <w:rStyle w:val="Hyperlink"/>
@@ -3005,7 +3172,7 @@
                 <w:noProof/>
                 <w:webHidden/>
               </w:rPr>
-              <w:instrText xml:space="preserve"> PAGEREF _Toc206603696 \h </w:instrText>
+              <w:instrText xml:space="preserve"> PAGEREF _Toc235007036 \h </w:instrText>
             </w:r>
             <w:r>
               <w:rPr>
@@ -3025,7 +3192,7 @@
                 <w:noProof/>
                 <w:webHidden/>
               </w:rPr>
-              <w:t>15</w:t>
+              <w:t>14</w:t>
             </w:r>
             <w:r>
               <w:rPr>
@@ -3045,10 +3212,14 @@
             <w:rPr>
               <w:rFonts w:asciiTheme="minorHAnsi" w:eastAsiaTheme="minorEastAsia" w:hAnsiTheme="minorHAnsi" w:cstheme="minorBidi"/>
               <w:noProof/>
+              <w:kern w:val="2"/>
+              <w:sz w:val="24"/>
+              <w:szCs w:val="24"/>
               <w:lang w:bidi="ar-SA"/>
-            </w:rPr>
-          </w:pPr>
-          <w:hyperlink w:anchor="_Toc206603697" w:history="1">
+              <w14:ligatures w14:val="standardContextual"/>
+            </w:rPr>
+          </w:pPr>
+          <w:hyperlink w:anchor="_Toc235007037" w:history="1">
             <w:r>
               <w:rPr>
                 <w:rStyle w:val="Hyperlink"/>
@@ -3075,7 +3246,7 @@
                 <w:noProof/>
                 <w:webHidden/>
               </w:rPr>
-              <w:instrText xml:space="preserve"> PAGEREF _Toc206603697 \h </w:instrText>
+              <w:instrText xml:space="preserve"> PAGEREF _Toc235007037 \h </w:instrText>
             </w:r>
             <w:r>
               <w:rPr>
@@ -3095,7 +3266,7 @@
                 <w:noProof/>
                 <w:webHidden/>
               </w:rPr>
-              <w:t>15</w:t>
+              <w:t>14</w:t>
             </w:r>
             <w:r>
               <w:rPr>
@@ -3113,7 +3284,7 @@
           <w:r>
             <w:fldChar w:fldCharType="end"/>
           </w:r>
-          <w:bookmarkStart w:id="0" w:name="_Toc206603656"/>
+          <w:bookmarkStart w:id="0" w:name="_Toc235006996"/>
           <w:r>
             <w:t>Change Log</w:t>
           </w:r>
@@ -3441,6 +3612,56 @@
               </w:p>
             </w:tc>
           </w:tr>
+          <w:tr>
+            <w:trPr>
+              <w:cnfStyle w:val="000000010000" w:firstRow="0" w:lastRow="0" w:firstColumn="0" w:lastColumn="0" w:oddVBand="0" w:evenVBand="0" w:oddHBand="0" w:evenHBand="1" w:firstRowFirstColumn="0" w:firstRowLastColumn="0" w:lastRowFirstColumn="0" w:lastRowLastColumn="0"/>
+              <w:cantSplit/>
+            </w:trPr>
+            <w:tc>
+              <w:tcPr>
+                <w:tcW w:w="1435" w:type="dxa"/>
+              </w:tcPr>
+              <w:p>
+                <w:pPr>
+                  <w:jc w:val="center"/>
+                </w:pPr>
+                <w:r>
+                  <w:t>v1.5</w:t>
+                </w:r>
+              </w:p>
+            </w:tc>
+            <w:tc>
+              <w:tcPr>
+                <w:tcW w:w="1530" w:type="dxa"/>
+              </w:tcPr>
+              <w:p>
+                <w:pPr>
+                  <w:jc w:val="center"/>
+                </w:pPr>
+                <w:r>
+                  <w:t>7/15/2026</w:t>
+                </w:r>
+              </w:p>
+            </w:tc>
+            <w:tc>
+              <w:tcPr>
+                <w:tcW w:w="6930" w:type="dxa"/>
+              </w:tcPr>
+              <w:p>
+                <w:r>
+                  <w:t xml:space="preserve">Addition of </w:t>
+                </w:r>
+                <w:proofErr w:type="spellStart"/>
+                <w:r>
+                  <w:t>CareerPathwayDescriptor</w:t>
+                </w:r>
+                <w:proofErr w:type="spellEnd"/>
+                <w:r>
+                  <w:t xml:space="preserve"> to MCCC Course resource for the SY 2026-2027 collection to support CTE courses.</w:t>
+                </w:r>
+              </w:p>
+            </w:tc>
+          </w:tr>
         </w:tbl>
         <w:p>
           <w:pPr>
@@ -3476,7 +3697,7 @@
               <w:lang w:bidi="ar-SA"/>
             </w:rPr>
           </w:pPr>
-          <w:bookmarkStart w:id="1" w:name="_Toc206603657"/>
+          <w:bookmarkStart w:id="1" w:name="_Toc235006997"/>
           <w:r>
             <w:rPr>
               <w:lang w:bidi="ar-SA"/>
@@ -3881,7 +4102,7 @@
           <w:pPr>
             <w:pStyle w:val="Heading3"/>
           </w:pPr>
-          <w:bookmarkStart w:id="2" w:name="_Toc206603658"/>
+          <w:bookmarkStart w:id="2" w:name="_Toc235006998"/>
           <w:r>
             <w:t>SIS Vendor Certification Requirements for MDE’s Ed-Fi System</w:t>
           </w:r>
@@ -4189,7 +4410,7 @@
           <w:pPr>
             <w:pStyle w:val="Heading4"/>
           </w:pPr>
-          <w:bookmarkStart w:id="3" w:name="_Toc206603659"/>
+          <w:bookmarkStart w:id="3" w:name="_Toc235006999"/>
           <w:r>
             <w:t xml:space="preserve">Preparation for </w:t>
           </w:r>
@@ -4215,7 +4436,15 @@
             <w:t xml:space="preserve">typically </w:t>
           </w:r>
           <w:r>
-            <w:t xml:space="preserve">creates a test sandbox ahead of the certification meeting. The SIS vendor communications the test sandbox key to MDE </w:t>
+            <w:t xml:space="preserve">creates a test sandbox ahead of the certification meeting. The SIS vendor </w:t>
+          </w:r>
+          <w:proofErr w:type="gramStart"/>
+          <w:r>
+            <w:t>communications</w:t>
+          </w:r>
+          <w:proofErr w:type="gramEnd"/>
+          <w:r>
+            <w:t xml:space="preserve"> the test sandbox key to MDE </w:t>
           </w:r>
           <w:r>
             <w:t xml:space="preserve">and MNIT </w:t>
@@ -4267,7 +4496,7 @@
           <w:pPr>
             <w:pStyle w:val="Heading3"/>
           </w:pPr>
-          <w:bookmarkStart w:id="4" w:name="_Toc206603660"/>
+          <w:bookmarkStart w:id="4" w:name="_Toc235007000"/>
           <w:r>
             <w:t>Reminders</w:t>
           </w:r>
@@ -4277,7 +4506,7 @@
           <w:pPr>
             <w:pStyle w:val="Heading4"/>
           </w:pPr>
-          <w:bookmarkStart w:id="5" w:name="_Toc206603661"/>
+          <w:bookmarkStart w:id="5" w:name="_Toc235007001"/>
           <w:r>
             <w:t xml:space="preserve">Production </w:t>
           </w:r>
@@ -4355,7 +4584,7 @@
           <w:pPr>
             <w:pStyle w:val="Heading4"/>
           </w:pPr>
-          <w:bookmarkStart w:id="6" w:name="_Toc206603662"/>
+          <w:bookmarkStart w:id="6" w:name="_Toc235007002"/>
           <w:r>
             <w:t>Update Your Ed-Fi Descriptors Annually</w:t>
           </w:r>
@@ -4376,7 +4605,7 @@
           <w:pPr>
             <w:pStyle w:val="Heading3"/>
           </w:pPr>
-          <w:bookmarkStart w:id="7" w:name="_Toc206603663"/>
+          <w:bookmarkStart w:id="7" w:name="_Toc235007003"/>
           <w:r>
             <w:t>Documentation Conventions</w:t>
           </w:r>
@@ -4483,7 +4712,7 @@
           <w:pPr>
             <w:pStyle w:val="Heading2"/>
           </w:pPr>
-          <w:bookmarkStart w:id="8" w:name="_Toc206603664"/>
+          <w:bookmarkStart w:id="8" w:name="_Toc235007004"/>
           <w:r>
             <w:t>Ed-Fi v6.2 API Reference for SY 202</w:t>
           </w:r>
@@ -4493,32 +4722,69 @@
           <w:r>
             <w:t>-202</w:t>
           </w:r>
+          <w:r>
+            <w:t>7</w:t>
+          </w:r>
           <w:bookmarkEnd w:id="8"/>
+        </w:p>
+        <w:p>
+          <w:pPr>
+            <w:pStyle w:val="Heading3"/>
+          </w:pPr>
+          <w:bookmarkStart w:id="9" w:name="_Toc235007005"/>
+          <w:r>
+            <w:t xml:space="preserve">Addition of </w:t>
+          </w:r>
+          <w:proofErr w:type="spellStart"/>
+          <w:r>
+            <w:t>CareerPathwayDescriptor</w:t>
+          </w:r>
+          <w:proofErr w:type="spellEnd"/>
+          <w:r>
+            <w:t xml:space="preserve"> to MCCC Course</w:t>
+          </w:r>
+          <w:r>
+            <w:t xml:space="preserve"> Data Collection for SY 2026-2027</w:t>
+          </w:r>
+          <w:bookmarkEnd w:id="9"/>
+        </w:p>
+        <w:p>
+          <w:r>
+            <w:t xml:space="preserve">MDE has added support for the </w:t>
+          </w:r>
+          <w:proofErr w:type="spellStart"/>
+          <w:r>
+            <w:t>CareerPathwayDescriptor</w:t>
+          </w:r>
+          <w:proofErr w:type="spellEnd"/>
+          <w:r>
+            <w:t xml:space="preserve"> data element on the Course resource to allow districts to submit Career &amp; Tech Ed (CTE) courses using the MCCC data collection for SY 2026-2027.</w:t>
+          </w:r>
+          <w:r>
+            <w:t xml:space="preserve">   </w:t>
+          </w:r>
+        </w:p>
+        <w:p>
+          <w:pPr>
+            <w:pStyle w:val="Heading3"/>
+          </w:pPr>
+          <w:bookmarkStart w:id="10" w:name="_Toc235007006"/>
+          <w:r>
+            <w:t>Removal of Unneeded Data Collections for</w:t>
+          </w:r>
+          <w:r>
+            <w:t xml:space="preserve"> SY 202</w:t>
+          </w:r>
+          <w:r>
+            <w:t>6</w:t>
+          </w:r>
+          <w:r>
+            <w:t>-202</w:t>
+          </w:r>
           <w:r>
             <w:t>7</w:t>
           </w:r>
-        </w:p>
-        <w:p>
-          <w:pPr>
-            <w:pStyle w:val="Heading3"/>
-          </w:pPr>
-          <w:bookmarkStart w:id="9" w:name="_Toc206603665"/>
-          <w:r>
-            <w:t>Removal of Unneeded Data Collections for</w:t>
-          </w:r>
-          <w:r>
-            <w:t xml:space="preserve"> SY 202</w:t>
-          </w:r>
-          <w:r>
-            <w:t>6</w:t>
-          </w:r>
-          <w:r>
-            <w:t>-202</w:t>
-          </w:r>
-          <w:bookmarkEnd w:id="9"/>
-          <w:r>
-            <w:t>7</w:t>
-          </w:r>
+          <w:bookmarkEnd w:id="10"/>
         </w:p>
         <w:p>
           <w:r>
@@ -4626,7 +4892,15 @@
                   <w:t xml:space="preserve">Ed-Fi Core: </w:t>
                 </w:r>
                 <w:r>
-                  <w:t>StudentEducationOrganizationAssociation StudentIndicator collection</w:t>
+                  <w:t xml:space="preserve">StudentEducationOrganizationAssociation </w:t>
+                </w:r>
+                <w:proofErr w:type="spellStart"/>
+                <w:r>
+                  <w:t>StudentIndicator</w:t>
+                </w:r>
+                <w:proofErr w:type="spellEnd"/>
+                <w:r>
+                  <w:t xml:space="preserve"> collection</w:t>
                 </w:r>
               </w:p>
             </w:tc>
@@ -4658,6 +4932,7 @@
                   <w:spacing w:before="0" w:after="0"/>
                 </w:pPr>
                 <w:r>
+                  <w:lastRenderedPageBreak/>
                   <w:t>Displaced Student / Student Crisis Events</w:t>
                 </w:r>
               </w:p>
@@ -4678,7 +4953,15 @@
                   <w:t>Ed-Fi Extension:</w:t>
                 </w:r>
                 <w:r>
-                  <w:t xml:space="preserve"> StudentEducationOrganizationAssociation StudentCrisisEvent collection</w:t>
+                  <w:t xml:space="preserve"> StudentEducationOrganizationAssociation </w:t>
+                </w:r>
+                <w:proofErr w:type="spellStart"/>
+                <w:r>
+                  <w:t>StudentCrisisEvent</w:t>
+                </w:r>
+                <w:proofErr w:type="spellEnd"/>
+                <w:r>
+                  <w:t xml:space="preserve"> collection</w:t>
                 </w:r>
               </w:p>
             </w:tc>
@@ -4739,8 +5022,13 @@
                   <w:spacing w:before="0" w:after="0"/>
                 </w:pPr>
                 <w:r>
-                  <w:t>StudentLanguageInstructionProgramAssociation LanguageInstructionProgramServiceOtherDescription</w:t>
+                  <w:t xml:space="preserve">StudentLanguageInstructionProgramAssociation </w:t>
                 </w:r>
+                <w:proofErr w:type="spellStart"/>
+                <w:r>
+                  <w:t>LanguageInstructionProgramServiceOtherDescription</w:t>
+                </w:r>
+                <w:proofErr w:type="spellEnd"/>
               </w:p>
             </w:tc>
             <w:tc>
@@ -4760,386 +5048,9 @@
         </w:tbl>
         <w:p>
           <w:pPr>
-            <w:spacing w:before="120" w:after="0"/>
-            <w:rPr>
-              <w:rFonts w:asciiTheme="minorHAnsi" w:eastAsiaTheme="majorEastAsia" w:hAnsiTheme="minorHAnsi" w:cs="Arial"/>
-              <w:b/>
-              <w:color w:val="003865" w:themeColor="accent1"/>
-              <w:sz w:val="26"/>
-              <w:szCs w:val="24"/>
-            </w:rPr>
-          </w:pPr>
-          <w:r>
-            <w:br w:type="page"/>
-          </w:r>
-        </w:p>
-        <w:p>
-          <w:pPr>
             <w:pStyle w:val="Heading3"/>
           </w:pPr>
-          <w:bookmarkStart w:id="10" w:name="_Toc206603666"/>
-          <w:r>
-            <w:lastRenderedPageBreak/>
-            <w:t>Descriptor Changes for SY 202</w:t>
-          </w:r>
-          <w:r>
-            <w:t>6</w:t>
-          </w:r>
-          <w:r>
-            <w:t>-202</w:t>
-          </w:r>
-          <w:bookmarkEnd w:id="10"/>
-          <w:r>
-            <w:t>7</w:t>
-          </w:r>
-        </w:p>
-        <w:p>
-          <w:r>
-            <w:t xml:space="preserve">Each descriptor name links to the corresponding </w:t>
-          </w:r>
-          <w:hyperlink r:id="rId9" w:history="1">
-            <w:r>
-              <w:rPr>
-                <w:rStyle w:val="Hyperlink"/>
-                <w:szCs w:val="20"/>
-              </w:rPr>
-              <w:t>MDE Ed-Fi API Descriptor Table</w:t>
-            </w:r>
-          </w:hyperlink>
-          <w:r>
-            <w:t xml:space="preserve"> on</w:t>
-          </w:r>
-          <w:r>
-            <w:rPr>
-              <w:rStyle w:val="Hyperlink"/>
-              <w:szCs w:val="20"/>
-            </w:rPr>
-            <w:t xml:space="preserve"> </w:t>
-          </w:r>
-          <w:hyperlink r:id="rId10" w:history="1">
-            <w:r>
-              <w:rPr>
-                <w:rStyle w:val="Hyperlink"/>
-                <w:szCs w:val="20"/>
-              </w:rPr>
-              <w:t>MDE’s Ed-Fi Documentation GitHub site</w:t>
-            </w:r>
-          </w:hyperlink>
-          <w:r>
-            <w:rPr>
-              <w:rStyle w:val="Hyperlink"/>
-              <w:szCs w:val="20"/>
-            </w:rPr>
-            <w:t>.</w:t>
-          </w:r>
-        </w:p>
-        <w:tbl>
-          <w:tblPr>
-            <w:tblStyle w:val="TableGrid1"/>
-            <w:tblW w:w="0" w:type="auto"/>
-            <w:tblLook w:val="04A0" w:firstRow="1" w:lastRow="0" w:firstColumn="1" w:lastColumn="0" w:noHBand="0" w:noVBand="1"/>
-            <w:tblDescription w:val="Table"/>
-          </w:tblPr>
-          <w:tblGrid>
-            <w:gridCol w:w="4225"/>
-            <w:gridCol w:w="5760"/>
-          </w:tblGrid>
-          <w:tr>
-            <w:trPr>
-              <w:cnfStyle w:val="100000000000" w:firstRow="1" w:lastRow="0" w:firstColumn="0" w:lastColumn="0" w:oddVBand="0" w:evenVBand="0" w:oddHBand="0" w:evenHBand="0" w:firstRowFirstColumn="0" w:firstRowLastColumn="0" w:lastRowFirstColumn="0" w:lastRowLastColumn="0"/>
-              <w:cantSplit/>
-              <w:tblHeader/>
-            </w:trPr>
-            <w:tc>
-              <w:tcPr>
-                <w:tcW w:w="4225" w:type="dxa"/>
-                <w:vAlign w:val="bottom"/>
-              </w:tcPr>
-              <w:p>
-                <w:pPr>
-                  <w:spacing w:before="0" w:after="0"/>
-                </w:pPr>
-                <w:r>
-                  <w:t>Descriptor Name</w:t>
-                </w:r>
-              </w:p>
-            </w:tc>
-            <w:tc>
-              <w:tcPr>
-                <w:tcW w:w="5760" w:type="dxa"/>
-                <w:vAlign w:val="bottom"/>
-              </w:tcPr>
-              <w:p>
-                <w:pPr>
-                  <w:spacing w:before="0" w:after="0"/>
-                  <w:rPr>
-                    <w:b w:val="0"/>
-                  </w:rPr>
-                </w:pPr>
-                <w:r>
-                  <w:t>Change Summary</w:t>
-                </w:r>
-              </w:p>
-            </w:tc>
-          </w:tr>
-          <w:tr>
-            <w:trPr>
-              <w:cnfStyle w:val="000000100000" w:firstRow="0" w:lastRow="0" w:firstColumn="0" w:lastColumn="0" w:oddVBand="0" w:evenVBand="0" w:oddHBand="1" w:evenHBand="0" w:firstRowFirstColumn="0" w:firstRowLastColumn="0" w:lastRowFirstColumn="0" w:lastRowLastColumn="0"/>
-              <w:cantSplit/>
-            </w:trPr>
-            <w:tc>
-              <w:tcPr>
-                <w:tcW w:w="4225" w:type="dxa"/>
-                <w:vAlign w:val="center"/>
-              </w:tcPr>
-              <w:p>
-                <w:pPr>
-                  <w:spacing w:before="0" w:after="0"/>
-                </w:pPr>
-              </w:p>
-            </w:tc>
-            <w:tc>
-              <w:tcPr>
-                <w:tcW w:w="5760" w:type="dxa"/>
-                <w:vAlign w:val="center"/>
-              </w:tcPr>
-              <w:p>
-                <w:pPr>
-                  <w:spacing w:before="0" w:after="0"/>
-                </w:pPr>
-              </w:p>
-            </w:tc>
-          </w:tr>
-          <w:tr>
-            <w:trPr>
-              <w:cnfStyle w:val="000000010000" w:firstRow="0" w:lastRow="0" w:firstColumn="0" w:lastColumn="0" w:oddVBand="0" w:evenVBand="0" w:oddHBand="0" w:evenHBand="1" w:firstRowFirstColumn="0" w:firstRowLastColumn="0" w:lastRowFirstColumn="0" w:lastRowLastColumn="0"/>
-              <w:cantSplit/>
-            </w:trPr>
-            <w:tc>
-              <w:tcPr>
-                <w:tcW w:w="4225" w:type="dxa"/>
-                <w:vAlign w:val="center"/>
-              </w:tcPr>
-              <w:p>
-                <w:pPr>
-                  <w:spacing w:before="0" w:after="0"/>
-                </w:pPr>
-              </w:p>
-            </w:tc>
-            <w:tc>
-              <w:tcPr>
-                <w:tcW w:w="5760" w:type="dxa"/>
-                <w:vAlign w:val="center"/>
-              </w:tcPr>
-              <w:p>
-                <w:pPr>
-                  <w:spacing w:before="0" w:after="0"/>
-                </w:pPr>
-              </w:p>
-            </w:tc>
-          </w:tr>
-          <w:tr>
-            <w:trPr>
-              <w:cnfStyle w:val="000000100000" w:firstRow="0" w:lastRow="0" w:firstColumn="0" w:lastColumn="0" w:oddVBand="0" w:evenVBand="0" w:oddHBand="1" w:evenHBand="0" w:firstRowFirstColumn="0" w:firstRowLastColumn="0" w:lastRowFirstColumn="0" w:lastRowLastColumn="0"/>
-              <w:cantSplit/>
-            </w:trPr>
-            <w:tc>
-              <w:tcPr>
-                <w:tcW w:w="4225" w:type="dxa"/>
-                <w:vAlign w:val="center"/>
-              </w:tcPr>
-              <w:p>
-                <w:pPr>
-                  <w:spacing w:before="0" w:after="0"/>
-                </w:pPr>
-              </w:p>
-            </w:tc>
-            <w:tc>
-              <w:tcPr>
-                <w:tcW w:w="5760" w:type="dxa"/>
-                <w:vAlign w:val="center"/>
-              </w:tcPr>
-              <w:p>
-                <w:pPr>
-                  <w:spacing w:before="0" w:after="0"/>
-                </w:pPr>
-              </w:p>
-            </w:tc>
-          </w:tr>
-          <w:tr>
-            <w:trPr>
-              <w:cnfStyle w:val="000000010000" w:firstRow="0" w:lastRow="0" w:firstColumn="0" w:lastColumn="0" w:oddVBand="0" w:evenVBand="0" w:oddHBand="0" w:evenHBand="1" w:firstRowFirstColumn="0" w:firstRowLastColumn="0" w:lastRowFirstColumn="0" w:lastRowLastColumn="0"/>
-              <w:cantSplit/>
-            </w:trPr>
-            <w:tc>
-              <w:tcPr>
-                <w:tcW w:w="4225" w:type="dxa"/>
-                <w:vAlign w:val="center"/>
-              </w:tcPr>
-              <w:p>
-                <w:pPr>
-                  <w:spacing w:before="0" w:after="0"/>
-                </w:pPr>
-              </w:p>
-            </w:tc>
-            <w:tc>
-              <w:tcPr>
-                <w:tcW w:w="5760" w:type="dxa"/>
-                <w:vAlign w:val="center"/>
-              </w:tcPr>
-              <w:p>
-                <w:pPr>
-                  <w:spacing w:before="0" w:after="0"/>
-                </w:pPr>
-              </w:p>
-            </w:tc>
-          </w:tr>
-          <w:tr>
-            <w:trPr>
-              <w:cnfStyle w:val="000000100000" w:firstRow="0" w:lastRow="0" w:firstColumn="0" w:lastColumn="0" w:oddVBand="0" w:evenVBand="0" w:oddHBand="1" w:evenHBand="0" w:firstRowFirstColumn="0" w:firstRowLastColumn="0" w:lastRowFirstColumn="0" w:lastRowLastColumn="0"/>
-              <w:cantSplit/>
-            </w:trPr>
-            <w:tc>
-              <w:tcPr>
-                <w:tcW w:w="4225" w:type="dxa"/>
-                <w:vAlign w:val="center"/>
-              </w:tcPr>
-              <w:p>
-                <w:pPr>
-                  <w:spacing w:before="0" w:after="0"/>
-                </w:pPr>
-              </w:p>
-            </w:tc>
-            <w:tc>
-              <w:tcPr>
-                <w:tcW w:w="5760" w:type="dxa"/>
-                <w:vAlign w:val="center"/>
-              </w:tcPr>
-              <w:p>
-                <w:pPr>
-                  <w:spacing w:before="0" w:after="0"/>
-                </w:pPr>
-              </w:p>
-            </w:tc>
-          </w:tr>
-          <w:tr>
-            <w:trPr>
-              <w:cnfStyle w:val="000000010000" w:firstRow="0" w:lastRow="0" w:firstColumn="0" w:lastColumn="0" w:oddVBand="0" w:evenVBand="0" w:oddHBand="0" w:evenHBand="1" w:firstRowFirstColumn="0" w:firstRowLastColumn="0" w:lastRowFirstColumn="0" w:lastRowLastColumn="0"/>
-              <w:cantSplit/>
-            </w:trPr>
-            <w:tc>
-              <w:tcPr>
-                <w:tcW w:w="4225" w:type="dxa"/>
-                <w:vAlign w:val="center"/>
-              </w:tcPr>
-              <w:p>
-                <w:pPr>
-                  <w:spacing w:before="0" w:after="0"/>
-                </w:pPr>
-              </w:p>
-            </w:tc>
-            <w:tc>
-              <w:tcPr>
-                <w:tcW w:w="5760" w:type="dxa"/>
-                <w:vAlign w:val="center"/>
-              </w:tcPr>
-              <w:p>
-                <w:pPr>
-                  <w:spacing w:before="0" w:after="0"/>
-                </w:pPr>
-              </w:p>
-            </w:tc>
-          </w:tr>
-          <w:tr>
-            <w:trPr>
-              <w:cnfStyle w:val="000000100000" w:firstRow="0" w:lastRow="0" w:firstColumn="0" w:lastColumn="0" w:oddVBand="0" w:evenVBand="0" w:oddHBand="1" w:evenHBand="0" w:firstRowFirstColumn="0" w:firstRowLastColumn="0" w:lastRowFirstColumn="0" w:lastRowLastColumn="0"/>
-              <w:cantSplit/>
-            </w:trPr>
-            <w:tc>
-              <w:tcPr>
-                <w:tcW w:w="4225" w:type="dxa"/>
-                <w:vAlign w:val="center"/>
-              </w:tcPr>
-              <w:p>
-                <w:pPr>
-                  <w:spacing w:before="0" w:after="0"/>
-                </w:pPr>
-              </w:p>
-            </w:tc>
-            <w:tc>
-              <w:tcPr>
-                <w:tcW w:w="5760" w:type="dxa"/>
-                <w:vAlign w:val="center"/>
-              </w:tcPr>
-              <w:p>
-                <w:pPr>
-                  <w:spacing w:before="0" w:after="0"/>
-                </w:pPr>
-              </w:p>
-            </w:tc>
-          </w:tr>
-          <w:tr>
-            <w:trPr>
-              <w:cnfStyle w:val="000000010000" w:firstRow="0" w:lastRow="0" w:firstColumn="0" w:lastColumn="0" w:oddVBand="0" w:evenVBand="0" w:oddHBand="0" w:evenHBand="1" w:firstRowFirstColumn="0" w:firstRowLastColumn="0" w:lastRowFirstColumn="0" w:lastRowLastColumn="0"/>
-              <w:cantSplit/>
-            </w:trPr>
-            <w:tc>
-              <w:tcPr>
-                <w:tcW w:w="4225" w:type="dxa"/>
-                <w:vAlign w:val="center"/>
-              </w:tcPr>
-              <w:p>
-                <w:pPr>
-                  <w:spacing w:before="0" w:after="0"/>
-                </w:pPr>
-              </w:p>
-            </w:tc>
-            <w:tc>
-              <w:tcPr>
-                <w:tcW w:w="5760" w:type="dxa"/>
-                <w:vAlign w:val="center"/>
-              </w:tcPr>
-              <w:p>
-                <w:pPr>
-                  <w:spacing w:before="0" w:after="0"/>
-                </w:pPr>
-              </w:p>
-            </w:tc>
-          </w:tr>
-          <w:tr>
-            <w:trPr>
-              <w:cnfStyle w:val="000000100000" w:firstRow="0" w:lastRow="0" w:firstColumn="0" w:lastColumn="0" w:oddVBand="0" w:evenVBand="0" w:oddHBand="1" w:evenHBand="0" w:firstRowFirstColumn="0" w:firstRowLastColumn="0" w:lastRowFirstColumn="0" w:lastRowLastColumn="0"/>
-              <w:cantSplit/>
-            </w:trPr>
-            <w:tc>
-              <w:tcPr>
-                <w:tcW w:w="4225" w:type="dxa"/>
-                <w:vAlign w:val="center"/>
-              </w:tcPr>
-              <w:p>
-                <w:pPr>
-                  <w:spacing w:before="0" w:after="0"/>
-                </w:pPr>
-              </w:p>
-            </w:tc>
-            <w:tc>
-              <w:tcPr>
-                <w:tcW w:w="5760" w:type="dxa"/>
-                <w:vAlign w:val="center"/>
-              </w:tcPr>
-              <w:p>
-                <w:pPr>
-                  <w:spacing w:before="0" w:after="0"/>
-                </w:pPr>
-              </w:p>
-            </w:tc>
-          </w:tr>
-        </w:tbl>
-        <w:p>
-          <w:pPr>
-            <w:pStyle w:val="Heading3"/>
-          </w:pPr>
-          <w:bookmarkStart w:id="11" w:name="_Toc206603667"/>
+          <w:bookmarkStart w:id="11" w:name="_Toc235007007"/>
           <w:r>
             <w:t xml:space="preserve">Ed-Fi </w:t>
           </w:r>
@@ -5182,7 +5093,7 @@
           <w:pPr>
             <w:pStyle w:val="Heading4"/>
           </w:pPr>
-          <w:bookmarkStart w:id="12" w:name="_Toc206603668"/>
+          <w:bookmarkStart w:id="12" w:name="_Toc235007008"/>
           <w:r>
             <w:t xml:space="preserve">Ed-Fi </w:t>
           </w:r>
@@ -5230,7 +5141,7 @@
           <w:pPr>
             <w:pStyle w:val="Heading4"/>
           </w:pPr>
-          <w:bookmarkStart w:id="13" w:name="_Toc206603669"/>
+          <w:bookmarkStart w:id="13" w:name="_Toc235007009"/>
           <w:r>
             <w:t xml:space="preserve">Ed-Fi </w:t>
           </w:r>
@@ -5284,7 +5195,7 @@
           <w:pPr>
             <w:pStyle w:val="Heading4"/>
           </w:pPr>
-          <w:bookmarkStart w:id="14" w:name="_Toc206603670"/>
+          <w:bookmarkStart w:id="14" w:name="_Toc235007010"/>
           <w:r>
             <w:t xml:space="preserve">Ed-Fi </w:t>
           </w:r>
@@ -5338,7 +5249,7 @@
           <w:pPr>
             <w:pStyle w:val="Heading3"/>
           </w:pPr>
-          <w:bookmarkStart w:id="15" w:name="_Toc206603671"/>
+          <w:bookmarkStart w:id="15" w:name="_Toc235007011"/>
           <w:r>
             <w:t xml:space="preserve">Ed-Fi </w:t>
           </w:r>
@@ -5404,7 +5315,7 @@
           <w:pPr>
             <w:pStyle w:val="Heading4"/>
           </w:pPr>
-          <w:bookmarkStart w:id="16" w:name="_Toc206603672"/>
+          <w:bookmarkStart w:id="16" w:name="_Toc235007012"/>
           <w:r>
             <w:t xml:space="preserve">Ed-Fi </w:t>
           </w:r>
@@ -5452,7 +5363,7 @@
           <w:pPr>
             <w:pStyle w:val="Heading4"/>
           </w:pPr>
-          <w:bookmarkStart w:id="17" w:name="_Toc206603673"/>
+          <w:bookmarkStart w:id="17" w:name="_Toc235007013"/>
           <w:r>
             <w:t xml:space="preserve">Ed-Fi </w:t>
           </w:r>
@@ -5506,63 +5417,63 @@
           <w:pPr>
             <w:pStyle w:val="Heading4"/>
           </w:pPr>
-          <w:bookmarkStart w:id="18" w:name="_Toc206603674"/>
+          <w:bookmarkStart w:id="18" w:name="_Toc235007014"/>
+          <w:r>
+            <w:t xml:space="preserve">Ed-Fi </w:t>
+          </w:r>
+          <w:r>
+            <w:t xml:space="preserve">v.6.2 </w:t>
+          </w:r>
+          <w:r>
+            <w:t>API OAuth URL</w:t>
+          </w:r>
+          <w:bookmarkEnd w:id="18"/>
+        </w:p>
+        <w:p>
+          <w:pPr>
+            <w:spacing w:line="259" w:lineRule="auto"/>
+            <w:rPr>
+              <w:szCs w:val="20"/>
+            </w:rPr>
+          </w:pPr>
+          <w:r>
+            <w:rPr>
+              <w:rFonts w:ascii="Courier New" w:hAnsi="Courier New" w:cs="Courier New"/>
+            </w:rPr>
+            <w:t>https://test.api</w:t>
+          </w:r>
+          <w:r>
+            <w:rPr>
+              <w:rFonts w:ascii="Courier New" w:hAnsi="Courier New" w:cs="Courier New"/>
+            </w:rPr>
+            <w:t>.education.mn.gov/</w:t>
+          </w:r>
+          <w:r>
+            <w:rPr>
+              <w:rFonts w:ascii="Courier New" w:hAnsi="Courier New" w:cs="Courier New"/>
+            </w:rPr>
+            <w:t>edfi</w:t>
+          </w:r>
+          <w:r>
+            <w:rPr>
+              <w:rFonts w:ascii="Courier New" w:hAnsi="Courier New" w:cs="Courier New"/>
+            </w:rPr>
+            <w:t>api/</w:t>
+          </w:r>
+          <w:r>
+            <w:rPr>
+              <w:rFonts w:ascii="Courier New" w:hAnsi="Courier New" w:cs="Courier New"/>
+            </w:rPr>
+            <w:t>oauth</w:t>
+          </w:r>
+        </w:p>
+        <w:p>
+          <w:pPr>
+            <w:pStyle w:val="Heading3"/>
+          </w:pPr>
+          <w:bookmarkStart w:id="19" w:name="_Toc235007015"/>
           <w:r>
             <w:lastRenderedPageBreak/>
-            <w:t xml:space="preserve">Ed-Fi </w:t>
-          </w:r>
-          <w:r>
-            <w:t xml:space="preserve">v.6.2 </w:t>
-          </w:r>
-          <w:r>
-            <w:t>API OAuth URL</w:t>
-          </w:r>
-          <w:bookmarkEnd w:id="18"/>
-        </w:p>
-        <w:p>
-          <w:pPr>
-            <w:spacing w:line="259" w:lineRule="auto"/>
-            <w:rPr>
-              <w:szCs w:val="20"/>
-            </w:rPr>
-          </w:pPr>
-          <w:r>
-            <w:rPr>
-              <w:rFonts w:ascii="Courier New" w:hAnsi="Courier New" w:cs="Courier New"/>
-            </w:rPr>
-            <w:t>https://test.api</w:t>
-          </w:r>
-          <w:r>
-            <w:rPr>
-              <w:rFonts w:ascii="Courier New" w:hAnsi="Courier New" w:cs="Courier New"/>
-            </w:rPr>
-            <w:t>.education.mn.gov/</w:t>
-          </w:r>
-          <w:r>
-            <w:rPr>
-              <w:rFonts w:ascii="Courier New" w:hAnsi="Courier New" w:cs="Courier New"/>
-            </w:rPr>
-            <w:t>edfi</w:t>
-          </w:r>
-          <w:r>
-            <w:rPr>
-              <w:rFonts w:ascii="Courier New" w:hAnsi="Courier New" w:cs="Courier New"/>
-            </w:rPr>
-            <w:t>api/</w:t>
-          </w:r>
-          <w:r>
-            <w:rPr>
-              <w:rFonts w:ascii="Courier New" w:hAnsi="Courier New" w:cs="Courier New"/>
-            </w:rPr>
-            <w:t>oauth</w:t>
-          </w:r>
-        </w:p>
-        <w:p>
-          <w:pPr>
-            <w:pStyle w:val="Heading3"/>
-          </w:pPr>
-          <w:bookmarkStart w:id="19" w:name="_Toc206603675"/>
-          <w:r>
             <w:t>Ed-Fi API URL</w:t>
           </w:r>
           <w:r>
@@ -5574,7 +5485,7 @@
           <w:pPr>
             <w:pStyle w:val="Heading4"/>
           </w:pPr>
-          <w:bookmarkStart w:id="20" w:name="_Toc206603676"/>
+          <w:bookmarkStart w:id="20" w:name="_Toc235007016"/>
           <w:r>
             <w:t>URLs in Test Sandbox vs. Production Environments</w:t>
           </w:r>
@@ -5645,6 +5556,7 @@
             </w:rPr>
             <w:t>…/</w:t>
           </w:r>
+          <w:proofErr w:type="spellStart"/>
           <w:r>
             <w:rPr>
               <w:rFonts w:ascii="Courier New" w:hAnsi="Courier New" w:cs="Courier New"/>
@@ -5659,7 +5571,16 @@
               <w:sz w:val="20"/>
               <w:szCs w:val="20"/>
             </w:rPr>
-            <w:t>api/data/v3/</w:t>
+            <w:t>api</w:t>
+          </w:r>
+          <w:proofErr w:type="spellEnd"/>
+          <w:r>
+            <w:rPr>
+              <w:rFonts w:ascii="Courier New" w:hAnsi="Courier New" w:cs="Courier New"/>
+              <w:sz w:val="20"/>
+              <w:szCs w:val="20"/>
+            </w:rPr>
+            <w:t>/data/v3/</w:t>
           </w:r>
           <w:r>
             <w:rPr>
@@ -5690,6 +5611,7 @@
             </w:rPr>
             <w:t>/</w:t>
           </w:r>
+          <w:proofErr w:type="spellStart"/>
           <w:r>
             <w:rPr>
               <w:rFonts w:ascii="Courier New" w:hAnsi="Courier New" w:cs="Courier New"/>
@@ -5697,16 +5619,28 @@
               <w:sz w:val="20"/>
               <w:szCs w:val="20"/>
             </w:rPr>
-            <w:t>ed-fi/</w:t>
-          </w:r>
+            <w:t>ed-fi</w:t>
+          </w:r>
+          <w:proofErr w:type="spellEnd"/>
           <w:r>
             <w:rPr>
               <w:rFonts w:ascii="Courier New" w:hAnsi="Courier New" w:cs="Courier New"/>
+              <w:bCs/>
+              <w:sz w:val="20"/>
+              <w:szCs w:val="20"/>
+            </w:rPr>
+            <w:t>/</w:t>
+          </w:r>
+          <w:proofErr w:type="spellStart"/>
+          <w:r>
+            <w:rPr>
+              <w:rFonts w:ascii="Courier New" w:hAnsi="Courier New" w:cs="Courier New"/>
               <w:sz w:val="20"/>
               <w:szCs w:val="20"/>
             </w:rPr>
             <w:t>studentSchoolAssociations</w:t>
           </w:r>
+          <w:proofErr w:type="spellEnd"/>
         </w:p>
         <w:p>
           <w:pPr>
@@ -5890,6 +5824,7 @@
             </w:rPr>
             <w:t>…/</w:t>
           </w:r>
+          <w:proofErr w:type="spellStart"/>
           <w:r>
             <w:rPr>
               <w:rFonts w:ascii="Courier New" w:hAnsi="Courier New" w:cs="Courier New"/>
@@ -5904,8 +5839,18 @@
               <w:sz w:val="20"/>
               <w:szCs w:val="20"/>
             </w:rPr>
-            <w:t>api/data/v3/</w:t>
-          </w:r>
+            <w:t>api</w:t>
+          </w:r>
+          <w:proofErr w:type="spellEnd"/>
+          <w:r>
+            <w:rPr>
+              <w:rFonts w:ascii="Courier New" w:hAnsi="Courier New" w:cs="Courier New"/>
+              <w:sz w:val="20"/>
+              <w:szCs w:val="20"/>
+            </w:rPr>
+            <w:t>/data/v3/</w:t>
+          </w:r>
+          <w:proofErr w:type="spellStart"/>
           <w:r>
             <w:rPr>
               <w:rFonts w:ascii="Courier New" w:hAnsi="Courier New" w:cs="Courier New"/>
@@ -5913,16 +5858,28 @@
               <w:sz w:val="20"/>
               <w:szCs w:val="20"/>
             </w:rPr>
-            <w:t>ed-fi/</w:t>
-          </w:r>
+            <w:t>ed-fi</w:t>
+          </w:r>
+          <w:proofErr w:type="spellEnd"/>
           <w:r>
             <w:rPr>
               <w:rFonts w:ascii="Courier New" w:hAnsi="Courier New" w:cs="Courier New"/>
+              <w:bCs/>
+              <w:sz w:val="20"/>
+              <w:szCs w:val="20"/>
+            </w:rPr>
+            <w:t>/</w:t>
+          </w:r>
+          <w:proofErr w:type="spellStart"/>
+          <w:r>
+            <w:rPr>
+              <w:rFonts w:ascii="Courier New" w:hAnsi="Courier New" w:cs="Courier New"/>
               <w:sz w:val="20"/>
               <w:szCs w:val="20"/>
             </w:rPr>
             <w:t>studentSchoolAssociations</w:t>
           </w:r>
+          <w:proofErr w:type="spellEnd"/>
         </w:p>
         <w:p>
           <w:r>
@@ -5939,7 +5896,7 @@
           <w:pPr>
             <w:pStyle w:val="Heading4"/>
           </w:pPr>
-          <w:bookmarkStart w:id="21" w:name="_Toc206603677"/>
+          <w:bookmarkStart w:id="21" w:name="_Toc235007017"/>
           <w:r>
             <w:t>Ed-Fi API Extension URLs</w:t>
           </w:r>
@@ -6117,7 +6074,7 @@
           <w:pPr>
             <w:pStyle w:val="Heading4"/>
           </w:pPr>
-          <w:bookmarkStart w:id="22" w:name="_Toc206603678"/>
+          <w:bookmarkStart w:id="22" w:name="_Toc235007018"/>
           <w:r>
             <w:t>Ed-Fi API Core URLs</w:t>
           </w:r>
@@ -6153,11 +6110,19 @@
             </w:rPr>
             <w:t>resources should include ‘</w:t>
           </w:r>
-          <w:r>
-            <w:rPr>
-              <w:szCs w:val="20"/>
-            </w:rPr>
-            <w:t>ed-fi’</w:t>
+          <w:proofErr w:type="spellStart"/>
+          <w:r>
+            <w:rPr>
+              <w:szCs w:val="20"/>
+            </w:rPr>
+            <w:t>ed-fi</w:t>
+          </w:r>
+          <w:proofErr w:type="spellEnd"/>
+          <w:r>
+            <w:rPr>
+              <w:szCs w:val="20"/>
+            </w:rPr>
+            <w:t>’</w:t>
           </w:r>
           <w:r>
             <w:rPr>
@@ -6232,6 +6197,7 @@
             </w:rPr>
             <w:t>…/</w:t>
           </w:r>
+          <w:proofErr w:type="spellStart"/>
           <w:r>
             <w:rPr>
               <w:rFonts w:ascii="Courier New" w:hAnsi="Courier New" w:cs="Courier New"/>
@@ -6246,14 +6212,23 @@
               <w:sz w:val="20"/>
               <w:szCs w:val="20"/>
             </w:rPr>
-            <w:t>api/data/v3</w:t>
-          </w:r>
+            <w:t>api</w:t>
+          </w:r>
+          <w:proofErr w:type="spellEnd"/>
           <w:r>
             <w:rPr>
               <w:rFonts w:ascii="Courier New" w:hAnsi="Courier New" w:cs="Courier New"/>
               <w:sz w:val="20"/>
               <w:szCs w:val="20"/>
             </w:rPr>
+            <w:t>/data/v3</w:t>
+          </w:r>
+          <w:r>
+            <w:rPr>
+              <w:rFonts w:ascii="Courier New" w:hAnsi="Courier New" w:cs="Courier New"/>
+              <w:sz w:val="20"/>
+              <w:szCs w:val="20"/>
+            </w:rPr>
             <w:t>/202</w:t>
           </w:r>
           <w:r>
@@ -6272,6 +6247,7 @@
             </w:rPr>
             <w:t>/</w:t>
           </w:r>
+          <w:proofErr w:type="spellStart"/>
           <w:r>
             <w:rPr>
               <w:rFonts w:ascii="Courier New" w:hAnsi="Courier New" w:cs="Courier New"/>
@@ -6282,6 +6258,7 @@
             </w:rPr>
             <w:t>ed-fi</w:t>
           </w:r>
+          <w:proofErr w:type="spellEnd"/>
           <w:r>
             <w:rPr>
               <w:rFonts w:ascii="Courier New" w:hAnsi="Courier New" w:cs="Courier New"/>
@@ -6290,6 +6267,7 @@
             </w:rPr>
             <w:t>/</w:t>
           </w:r>
+          <w:proofErr w:type="spellStart"/>
           <w:r>
             <w:rPr>
               <w:rFonts w:ascii="Courier New" w:hAnsi="Courier New" w:cs="Courier New"/>
@@ -6314,14 +6292,20 @@
             </w:rPr>
             <w:t>s</w:t>
           </w:r>
+          <w:proofErr w:type="spellEnd"/>
         </w:p>
         <w:p>
           <w:pPr>
             <w:pStyle w:val="Heading4"/>
           </w:pPr>
-          <w:bookmarkStart w:id="23" w:name="_Toc206603679"/>
-          <w:r>
-            <w:t>Ed-FI API Authentication (OAuth) URL</w:t>
+          <w:bookmarkStart w:id="23" w:name="_Toc235007019"/>
+          <w:proofErr w:type="spellStart"/>
+          <w:r>
+            <w:t>Ed-FI</w:t>
+          </w:r>
+          <w:proofErr w:type="spellEnd"/>
+          <w:r>
+            <w:t xml:space="preserve"> API Authentication (OAuth) URL</w:t>
           </w:r>
           <w:bookmarkEnd w:id="23"/>
         </w:p>
@@ -6389,12 +6373,26 @@
           <w:r>
             <w:t xml:space="preserve">the </w:t>
           </w:r>
-          <w:hyperlink r:id="rId11" w:history="1">
+          <w:hyperlink r:id="rId9" w:history="1">
             <w:r>
               <w:rPr>
                 <w:rStyle w:val="Hyperlink"/>
               </w:rPr>
-              <w:t>Ed-Fi TechDocs Website</w:t>
+              <w:t xml:space="preserve">Ed-Fi </w:t>
+            </w:r>
+            <w:proofErr w:type="spellStart"/>
+            <w:r>
+              <w:rPr>
+                <w:rStyle w:val="Hyperlink"/>
+              </w:rPr>
+              <w:t>TechDocs</w:t>
+            </w:r>
+            <w:proofErr w:type="spellEnd"/>
+            <w:r>
+              <w:rPr>
+                <w:rStyle w:val="Hyperlink"/>
+              </w:rPr>
+              <w:t xml:space="preserve"> Website</w:t>
             </w:r>
           </w:hyperlink>
           <w:r>
@@ -6405,7 +6403,7 @@
           <w:pPr>
             <w:pStyle w:val="Heading2"/>
           </w:pPr>
-          <w:bookmarkStart w:id="24" w:name="_Toc206603680"/>
+          <w:bookmarkStart w:id="24" w:name="_Toc235007020"/>
           <w:r>
             <w:t>MDE Ed-Fi Test Sandbox Certification Testing</w:t>
           </w:r>
@@ -6424,7 +6422,7 @@
             </w:rPr>
             <w:t xml:space="preserve">See </w:t>
           </w:r>
-          <w:hyperlink r:id="rId12" w:history="1">
+          <w:hyperlink r:id="rId10" w:history="1">
             <w:r>
               <w:rPr>
                 <w:rStyle w:val="Hyperlink"/>
@@ -6451,7 +6449,7 @@
             </w:rPr>
             <w:t xml:space="preserve"> </w:t>
           </w:r>
-          <w:hyperlink r:id="rId13" w:history="1">
+          <w:hyperlink r:id="rId11" w:history="1">
             <w:r>
               <w:rPr>
                 <w:rStyle w:val="Hyperlink"/>
@@ -6515,7 +6513,7 @@
             </w:rPr>
             <w:t xml:space="preserve"> and </w:t>
           </w:r>
-          <w:hyperlink r:id="rId14" w:history="1">
+          <w:hyperlink r:id="rId12" w:history="1">
             <w:r>
               <w:rPr>
                 <w:rStyle w:val="Hyperlink"/>
@@ -6542,50 +6540,140 @@
             <w:rPr>
               <w:szCs w:val="20"/>
             </w:rPr>
+            <w:t xml:space="preserve">When certification begins, </w:t>
+          </w:r>
+          <w:r>
+            <w:rPr>
+              <w:szCs w:val="20"/>
+            </w:rPr>
+            <w:t xml:space="preserve">vendors </w:t>
+          </w:r>
+          <w:r>
+            <w:rPr>
+              <w:szCs w:val="20"/>
+            </w:rPr>
+            <w:t xml:space="preserve">will be required to generate </w:t>
+          </w:r>
+          <w:r>
+            <w:rPr>
+              <w:szCs w:val="20"/>
+            </w:rPr>
+            <w:t xml:space="preserve">a </w:t>
+          </w:r>
+          <w:r>
+            <w:rPr>
+              <w:szCs w:val="20"/>
+            </w:rPr>
+            <w:t xml:space="preserve">key and secret to a </w:t>
+          </w:r>
+          <w:r>
+            <w:rPr>
+              <w:szCs w:val="20"/>
+            </w:rPr>
+            <w:t>sandbox ODS/API with</w:t>
+          </w:r>
+          <w:r>
+            <w:rPr>
+              <w:szCs w:val="20"/>
+            </w:rPr>
+            <w:t xml:space="preserve"> no </w:t>
+          </w:r>
+          <w:r>
+            <w:rPr>
+              <w:szCs w:val="20"/>
+            </w:rPr>
+            <w:t>sample data pre-loaded.</w:t>
+          </w:r>
+          <w:r>
+            <w:rPr>
+              <w:szCs w:val="20"/>
+            </w:rPr>
+            <w:t xml:space="preserve"> </w:t>
+          </w:r>
+          <w:r>
+            <w:rPr>
+              <w:szCs w:val="20"/>
+            </w:rPr>
+            <w:t xml:space="preserve">This ODS </w:t>
+          </w:r>
+          <w:r>
+            <w:rPr>
+              <w:szCs w:val="20"/>
+            </w:rPr>
+            <w:t xml:space="preserve">will </w:t>
+          </w:r>
+          <w:r>
+            <w:rPr>
+              <w:szCs w:val="20"/>
+            </w:rPr>
+            <w:t xml:space="preserve">contain the </w:t>
+          </w:r>
+          <w:r>
+            <w:rPr>
+              <w:szCs w:val="20"/>
+            </w:rPr>
+            <w:t>MDE</w:t>
+          </w:r>
+          <w:r>
+            <w:rPr>
+              <w:szCs w:val="20"/>
+            </w:rPr>
+            <w:t xml:space="preserve"> </w:t>
+          </w:r>
+          <w:r>
+            <w:rPr>
+              <w:szCs w:val="20"/>
+            </w:rPr>
+            <w:t xml:space="preserve">School and Local Education Agency (LEA) </w:t>
+          </w:r>
+          <w:r>
+            <w:rPr>
+              <w:szCs w:val="20"/>
+            </w:rPr>
+            <w:t xml:space="preserve">records </w:t>
+          </w:r>
+          <w:r>
+            <w:rPr>
+              <w:szCs w:val="20"/>
+            </w:rPr>
+            <w:t xml:space="preserve">synchronized with </w:t>
+          </w:r>
+          <w:r>
+            <w:rPr>
+              <w:szCs w:val="20"/>
+            </w:rPr>
+            <w:t xml:space="preserve">MDE-ORG, </w:t>
+          </w:r>
+          <w:r>
+            <w:rPr>
+              <w:szCs w:val="20"/>
+            </w:rPr>
+            <w:t xml:space="preserve">MDE-specific </w:t>
+          </w:r>
+          <w:r>
+            <w:rPr>
+              <w:szCs w:val="20"/>
+            </w:rPr>
+            <w:t>descriptors</w:t>
+          </w:r>
+          <w:r>
+            <w:rPr>
+              <w:szCs w:val="20"/>
+            </w:rPr>
+            <w:t xml:space="preserve">, LEA Programs, and the State Course Catalog and Staff </w:t>
+          </w:r>
+          <w:r>
+            <w:rPr>
+              <w:szCs w:val="20"/>
+            </w:rPr>
             <w:lastRenderedPageBreak/>
-            <w:t xml:space="preserve">When certification begins, </w:t>
-          </w:r>
-          <w:r>
-            <w:rPr>
-              <w:szCs w:val="20"/>
-            </w:rPr>
-            <w:t xml:space="preserve">vendors </w:t>
-          </w:r>
-          <w:r>
-            <w:rPr>
-              <w:szCs w:val="20"/>
-            </w:rPr>
-            <w:t xml:space="preserve">will be required to generate </w:t>
-          </w:r>
-          <w:r>
-            <w:rPr>
-              <w:szCs w:val="20"/>
-            </w:rPr>
-            <w:t xml:space="preserve">a </w:t>
-          </w:r>
-          <w:r>
-            <w:rPr>
-              <w:szCs w:val="20"/>
-            </w:rPr>
-            <w:t xml:space="preserve">key and secret to a </w:t>
-          </w:r>
-          <w:r>
-            <w:rPr>
-              <w:szCs w:val="20"/>
-            </w:rPr>
-            <w:t>sandbox ODS/API with</w:t>
-          </w:r>
-          <w:r>
-            <w:rPr>
-              <w:szCs w:val="20"/>
-            </w:rPr>
-            <w:t xml:space="preserve"> no </w:t>
-          </w:r>
-          <w:r>
-            <w:rPr>
-              <w:szCs w:val="20"/>
-            </w:rPr>
-            <w:t>sample data pre-loaded.</w:t>
+            <w:t>records required for the Minnesota Common Course Catalog (MCCC) data collection</w:t>
+          </w:r>
+          <w:r>
+            <w:rPr>
+              <w:szCs w:val="20"/>
+            </w:rPr>
+            <w:t>.</w:t>
           </w:r>
           <w:r>
             <w:rPr>
@@ -6597,90 +6685,6 @@
             <w:rPr>
               <w:szCs w:val="20"/>
             </w:rPr>
-            <w:t xml:space="preserve">This ODS </w:t>
-          </w:r>
-          <w:r>
-            <w:rPr>
-              <w:szCs w:val="20"/>
-            </w:rPr>
-            <w:t xml:space="preserve">will </w:t>
-          </w:r>
-          <w:r>
-            <w:rPr>
-              <w:szCs w:val="20"/>
-            </w:rPr>
-            <w:t xml:space="preserve">contain the </w:t>
-          </w:r>
-          <w:r>
-            <w:rPr>
-              <w:szCs w:val="20"/>
-            </w:rPr>
-            <w:t>MDE</w:t>
-          </w:r>
-          <w:r>
-            <w:rPr>
-              <w:szCs w:val="20"/>
-            </w:rPr>
-            <w:t xml:space="preserve"> </w:t>
-          </w:r>
-          <w:r>
-            <w:rPr>
-              <w:szCs w:val="20"/>
-            </w:rPr>
-            <w:t xml:space="preserve">School and Local Education Agency (LEA) </w:t>
-          </w:r>
-          <w:r>
-            <w:rPr>
-              <w:szCs w:val="20"/>
-            </w:rPr>
-            <w:t xml:space="preserve">records </w:t>
-          </w:r>
-          <w:r>
-            <w:rPr>
-              <w:szCs w:val="20"/>
-            </w:rPr>
-            <w:t xml:space="preserve">synchronized with </w:t>
-          </w:r>
-          <w:r>
-            <w:rPr>
-              <w:szCs w:val="20"/>
-            </w:rPr>
-            <w:t xml:space="preserve">MDE-ORG, </w:t>
-          </w:r>
-          <w:r>
-            <w:rPr>
-              <w:szCs w:val="20"/>
-            </w:rPr>
-            <w:t xml:space="preserve">MDE-specific </w:t>
-          </w:r>
-          <w:r>
-            <w:rPr>
-              <w:szCs w:val="20"/>
-            </w:rPr>
-            <w:t>descriptors</w:t>
-          </w:r>
-          <w:r>
-            <w:rPr>
-              <w:szCs w:val="20"/>
-            </w:rPr>
-            <w:t>, LEA Programs, and the State Course Catalog and Staff records required for the Minnesota Common Course Catalog (MCCC) data collection</w:t>
-          </w:r>
-          <w:r>
-            <w:rPr>
-              <w:szCs w:val="20"/>
-            </w:rPr>
-            <w:t>.</w:t>
-          </w:r>
-          <w:r>
-            <w:rPr>
-              <w:szCs w:val="20"/>
-            </w:rPr>
-            <w:t xml:space="preserve"> </w:t>
-          </w:r>
-          <w:r>
-            <w:rPr>
-              <w:szCs w:val="20"/>
-            </w:rPr>
             <w:t xml:space="preserve">When submitting data for each of the </w:t>
           </w:r>
           <w:r>
@@ -6742,7 +6746,7 @@
           <w:pPr>
             <w:pStyle w:val="Heading3"/>
           </w:pPr>
-          <w:bookmarkStart w:id="25" w:name="_Toc206603681"/>
+          <w:bookmarkStart w:id="25" w:name="_Toc235007021"/>
           <w:r>
             <w:rPr>
               <w:noProof/>
@@ -6772,7 +6776,7 @@
                         <pic:cNvPicPr/>
                       </pic:nvPicPr>
                       <pic:blipFill rotWithShape="1">
-                        <a:blip r:embed="rId15" cstate="print">
+                        <a:blip r:embed="rId13" cstate="print">
                           <a:extLst>
                             <a:ext uri="{28A0092B-C50C-407E-A947-70E740481C1C}">
                               <a14:useLocalDpi xmlns:a14="http://schemas.microsoft.com/office/drawing/2010/main" val="0"/>
@@ -6848,7 +6852,7 @@
           <w:bookmarkEnd w:id="25"/>
         </w:p>
         <w:p>
-          <w:hyperlink r:id="rId16" w:history="1">
+          <w:hyperlink r:id="rId14" w:history="1">
             <w:r>
               <w:rPr>
                 <w:rStyle w:val="Hyperlink"/>
@@ -6917,7 +6921,7 @@
             </w:rPr>
             <w:t>. To request an account, </w:t>
           </w:r>
-          <w:hyperlink r:id="rId17" w:history="1">
+          <w:hyperlink r:id="rId15" w:history="1">
             <w:r>
               <w:rPr>
                 <w:rStyle w:val="Hyperlink"/>
@@ -6969,7 +6973,7 @@
             <mc:AlternateContent>
               <mc:Choice Requires="wpg">
                 <w:drawing>
-                  <wp:anchor distT="0" distB="0" distL="114300" distR="114300" simplePos="0" relativeHeight="251657216" behindDoc="0" locked="0" layoutInCell="1" allowOverlap="1" wp14:anchorId="65F5C7F8" wp14:editId="15F97AF6">
+                  <wp:anchor distT="0" distB="0" distL="114300" distR="114300" simplePos="0" relativeHeight="251657216" behindDoc="0" locked="0" layoutInCell="1" allowOverlap="1" wp14:anchorId="65F5C7F8" wp14:editId="01E60EA9">
                     <wp:simplePos x="0" y="0"/>
                     <wp:positionH relativeFrom="margin">
                       <wp:posOffset>3503930</wp:posOffset>
@@ -7002,7 +7006,7 @@
                               </pic:cNvPicPr>
                             </pic:nvPicPr>
                             <pic:blipFill rotWithShape="1">
-                              <a:blip r:embed="rId18" cstate="print">
+                              <a:blip r:embed="rId16" cstate="print">
                                 <a:extLst>
                                   <a:ext uri="{28A0092B-C50C-407E-A947-70E740481C1C}">
                                     <a14:useLocalDpi xmlns:a14="http://schemas.microsoft.com/office/drawing/2010/main" val="0"/>
@@ -7142,7 +7146,7 @@
                 <w:pict>
                   <v:group w14:anchorId="65F5C7F8" id="Group 1" o:spid="_x0000_s1026" style="position:absolute;margin-left:275.9pt;margin-top:153.55pt;width:252.25pt;height:165.9pt;z-index:251657216;mso-position-horizontal-relative:margin;mso-position-vertical-relative:margin" coordsize="32035,21073" o:gfxdata="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">
                     <v:shape id="Picture 4" o:spid="_x0000_s1027" type="#_x0000_t75" style="position:absolute;top:423;width:31508;height:20650;visibility:visible;mso-wrap-style:square" o:gfxdata="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">
-                      <v:imagedata r:id="rId19" o:title="" croptop="10077f"/>
+                      <v:imagedata r:id="rId17" o:title="" croptop="10077f"/>
                     </v:shape>
                     <v:oval id="Oval 2" o:spid="_x0000_s1028" style="position:absolute;left:9061;width:22974;height:3732;visibility:visible;mso-wrap-style:square;v-text-anchor:middle" o:gfxdata="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" filled="f" strokecolor="#c00000" strokeweight="2.25pt"/>
                     <v:shapetype id="_x0000_t47" coordsize="21600,21600" o:spt="47" adj="-8280,24300,-1800,4050" path="m@0@1l@2@3nfem,l21600,r,21600l,21600xe">
@@ -7211,29 +7215,39 @@
             </w:rPr>
             <w:t xml:space="preserve">he </w:t>
           </w:r>
-          <w:hyperlink r:id="rId20" w:history="1">
+          <w:hyperlink r:id="rId18" w:history="1">
             <w:r>
               <w:rPr>
                 <w:rStyle w:val="Hyperlink"/>
                 <w:rFonts w:asciiTheme="minorHAnsi" w:hAnsiTheme="minorHAnsi"/>
                 <w:shd w:val="clear" w:color="auto" w:fill="FFFFFF"/>
               </w:rPr>
-              <w:t>Ed-Fi TechDocs</w:t>
-            </w:r>
+              <w:t xml:space="preserve">Ed-Fi </w:t>
+            </w:r>
+            <w:proofErr w:type="spellStart"/>
             <w:r>
               <w:rPr>
                 <w:rStyle w:val="Hyperlink"/>
                 <w:rFonts w:asciiTheme="minorHAnsi" w:hAnsiTheme="minorHAnsi"/>
                 <w:shd w:val="clear" w:color="auto" w:fill="FFFFFF"/>
               </w:rPr>
-              <w:t xml:space="preserve"> Website</w:t>
-            </w:r>
+              <w:t>TechDocs</w:t>
+            </w:r>
+            <w:proofErr w:type="spellEnd"/>
             <w:r>
               <w:rPr>
                 <w:rStyle w:val="Hyperlink"/>
                 <w:rFonts w:asciiTheme="minorHAnsi" w:hAnsiTheme="minorHAnsi"/>
                 <w:shd w:val="clear" w:color="auto" w:fill="FFFFFF"/>
               </w:rPr>
+              <w:t xml:space="preserve"> Website</w:t>
+            </w:r>
+            <w:r>
+              <w:rPr>
+                <w:rStyle w:val="Hyperlink"/>
+                <w:rFonts w:asciiTheme="minorHAnsi" w:hAnsiTheme="minorHAnsi"/>
+                <w:shd w:val="clear" w:color="auto" w:fill="FFFFFF"/>
+              </w:rPr>
               <w:t> </w:t>
             </w:r>
           </w:hyperlink>
@@ -7306,7 +7320,7 @@
           <w:pPr>
             <w:pStyle w:val="Heading3"/>
           </w:pPr>
-          <w:bookmarkStart w:id="26" w:name="_Toc206603682"/>
+          <w:bookmarkStart w:id="26" w:name="_Toc235007022"/>
           <w:r>
             <w:t xml:space="preserve">Ed-Fi Swagger </w:t>
           </w:r>
@@ -7321,7 +7335,7 @@
               <w:rStyle w:val="Hyperlink"/>
             </w:rPr>
           </w:pPr>
-          <w:hyperlink r:id="rId21" w:history="1">
+          <w:hyperlink r:id="rId19" w:history="1">
             <w:r>
               <w:rPr>
                 <w:rStyle w:val="Hyperlink"/>
@@ -7598,7 +7612,25 @@
               <w:iCs/>
               <w:szCs w:val="20"/>
             </w:rPr>
-            <w:t xml:space="preserve">-SISVendor-Profile </w:t>
+            <w:t>-</w:t>
+          </w:r>
+          <w:proofErr w:type="spellStart"/>
+          <w:r>
+            <w:rPr>
+              <w:rFonts w:asciiTheme="minorHAnsi" w:eastAsia="Arial" w:hAnsiTheme="minorHAnsi" w:cs="Arial"/>
+              <w:iCs/>
+              <w:szCs w:val="20"/>
+            </w:rPr>
+            <w:t>SISVendor</w:t>
+          </w:r>
+          <w:proofErr w:type="spellEnd"/>
+          <w:r>
+            <w:rPr>
+              <w:rFonts w:asciiTheme="minorHAnsi" w:eastAsia="Arial" w:hAnsiTheme="minorHAnsi" w:cs="Arial"/>
+              <w:iCs/>
+              <w:szCs w:val="20"/>
+            </w:rPr>
+            <w:t xml:space="preserve">-Profile </w:t>
           </w:r>
           <w:r>
             <w:rPr>
@@ -7783,7 +7815,25 @@
               <w:iCs/>
               <w:szCs w:val="20"/>
             </w:rPr>
-            <w:t xml:space="preserve">-SISVendor-Profile </w:t>
+            <w:t>-</w:t>
+          </w:r>
+          <w:proofErr w:type="spellStart"/>
+          <w:r>
+            <w:rPr>
+              <w:rFonts w:asciiTheme="minorHAnsi" w:eastAsia="Arial" w:hAnsiTheme="minorHAnsi" w:cs="Arial"/>
+              <w:iCs/>
+              <w:szCs w:val="20"/>
+            </w:rPr>
+            <w:t>SISVendor</w:t>
+          </w:r>
+          <w:proofErr w:type="spellEnd"/>
+          <w:r>
+            <w:rPr>
+              <w:rFonts w:asciiTheme="minorHAnsi" w:eastAsia="Arial" w:hAnsiTheme="minorHAnsi" w:cs="Arial"/>
+              <w:iCs/>
+              <w:szCs w:val="20"/>
+            </w:rPr>
+            <w:t xml:space="preserve">-Profile </w:t>
           </w:r>
           <w:r>
             <w:rPr>
@@ -7966,8 +8016,9 @@
               <w:iCs/>
               <w:szCs w:val="20"/>
             </w:rPr>
-            <w:t>documentation is not available</w:t>
-          </w:r>
+            <w:t xml:space="preserve">documentation is not </w:t>
+          </w:r>
+          <w:proofErr w:type="gramStart"/>
           <w:r>
             <w:rPr>
               <w:rFonts w:asciiTheme="minorHAnsi" w:eastAsia="Arial" w:hAnsiTheme="minorHAnsi" w:cs="Arial"/>
@@ -7975,8 +8026,9 @@
               <w:iCs/>
               <w:szCs w:val="20"/>
             </w:rPr>
-            <w:t xml:space="preserve"> the Ed-Fi Swagger tool</w:t>
-          </w:r>
+            <w:t>available</w:t>
+          </w:r>
+          <w:proofErr w:type="gramEnd"/>
           <w:r>
             <w:rPr>
               <w:rFonts w:asciiTheme="minorHAnsi" w:eastAsia="Arial" w:hAnsiTheme="minorHAnsi" w:cs="Arial"/>
@@ -7984,7 +8036,7 @@
               <w:iCs/>
               <w:szCs w:val="20"/>
             </w:rPr>
-            <w:t xml:space="preserve"> in the </w:t>
+            <w:t xml:space="preserve"> the Ed-Fi Swagger tool</w:t>
           </w:r>
           <w:r>
             <w:rPr>
@@ -7993,7 +8045,7 @@
               <w:iCs/>
               <w:szCs w:val="20"/>
             </w:rPr>
-            <w:t xml:space="preserve">Ed-Fi Test </w:t>
+            <w:t xml:space="preserve"> in the </w:t>
           </w:r>
           <w:r>
             <w:rPr>
@@ -8002,6 +8054,15 @@
               <w:iCs/>
               <w:szCs w:val="20"/>
             </w:rPr>
+            <w:t xml:space="preserve">Ed-Fi Test </w:t>
+          </w:r>
+          <w:r>
+            <w:rPr>
+              <w:rFonts w:asciiTheme="minorHAnsi" w:eastAsia="Arial" w:hAnsiTheme="minorHAnsi" w:cs="Arial"/>
+              <w:i/>
+              <w:iCs/>
+              <w:szCs w:val="20"/>
+            </w:rPr>
             <w:t>Sandbox environment.</w:t>
           </w:r>
         </w:p>
@@ -8009,7 +8070,7 @@
           <w:pPr>
             <w:pStyle w:val="Heading3"/>
           </w:pPr>
-          <w:bookmarkStart w:id="27" w:name="_Toc206603683"/>
+          <w:bookmarkStart w:id="27" w:name="_Toc235007023"/>
           <w:r>
             <w:t>Minimal vs. Populated Test Sandbox ODS Databases</w:t>
           </w:r>
@@ -8038,7 +8099,21 @@
             <w:rPr>
               <w:szCs w:val="20"/>
             </w:rPr>
-            <w:t xml:space="preserve"> is associated with St. Paul Public School District (LocalEducationAgencyId = 10625000). When you do not select the “populated” option to include sample data, your sandbox database will be loaded with an empty (“minimal”) ODS</w:t>
+            <w:t xml:space="preserve"> is associated with St. Paul Public School District (</w:t>
+          </w:r>
+          <w:proofErr w:type="spellStart"/>
+          <w:r>
+            <w:rPr>
+              <w:szCs w:val="20"/>
+            </w:rPr>
+            <w:t>LocalEducationAgencyId</w:t>
+          </w:r>
+          <w:proofErr w:type="spellEnd"/>
+          <w:r>
+            <w:rPr>
+              <w:szCs w:val="20"/>
+            </w:rPr>
+            <w:t xml:space="preserve"> = 10625000). When you do not select the “populated” option to include sample data, your sandbox database will be loaded with an empty (“minimal”) ODS</w:t>
           </w:r>
           <w:r>
             <w:rPr>
@@ -8088,7 +8163,6 @@
             <w:rPr>
               <w:szCs w:val="20"/>
             </w:rPr>
-            <w:lastRenderedPageBreak/>
             <w:t>Descriptors customized for MDE’s Ed-Fi ODS/API</w:t>
           </w:r>
         </w:p>
@@ -8140,6 +8214,7 @@
             <w:rPr>
               <w:i/>
             </w:rPr>
+            <w:lastRenderedPageBreak/>
             <w:t xml:space="preserve">NOTE: Due to the limited usefulness of the “populated” data set, the populated database template is no longer maintained but is still available as an option for creating test sandbox Ed-Fi ODS databases. </w:t>
           </w:r>
         </w:p>
@@ -8168,7 +8243,7 @@
           <w:pPr>
             <w:pStyle w:val="Heading3"/>
           </w:pPr>
-          <w:bookmarkStart w:id="28" w:name="_Toc206603684"/>
+          <w:bookmarkStart w:id="28" w:name="_Toc235007024"/>
           <w:r>
             <w:t xml:space="preserve">Other </w:t>
           </w:r>
@@ -8294,11 +8369,19 @@
             </w:rPr>
             <w:t xml:space="preserve">are </w:t>
           </w:r>
-          <w:r>
-            <w:rPr>
-              <w:szCs w:val="20"/>
-            </w:rPr>
-            <w:t>auto-enabled in Staging and Production</w:t>
+          <w:proofErr w:type="gramStart"/>
+          <w:r>
+            <w:rPr>
+              <w:szCs w:val="20"/>
+            </w:rPr>
+            <w:t>auto-enabled</w:t>
+          </w:r>
+          <w:proofErr w:type="gramEnd"/>
+          <w:r>
+            <w:rPr>
+              <w:szCs w:val="20"/>
+            </w:rPr>
+            <w:t xml:space="preserve"> in Staging and Production</w:t>
           </w:r>
           <w:r>
             <w:rPr>
@@ -8335,7 +8418,7 @@
           <w:pPr>
             <w:pStyle w:val="Heading2"/>
           </w:pPr>
-          <w:bookmarkStart w:id="29" w:name="_Toc206603685"/>
+          <w:bookmarkStart w:id="29" w:name="_Toc235007025"/>
           <w:r>
             <w:t>MDE Ed-Fi API Documentation</w:t>
           </w:r>
@@ -8348,7 +8431,7 @@
               <w:shd w:val="clear" w:color="auto" w:fill="FFFFFF"/>
             </w:rPr>
           </w:pPr>
-          <w:bookmarkStart w:id="30" w:name="_Toc206603686"/>
+          <w:bookmarkStart w:id="30" w:name="_Toc235007026"/>
           <w:r>
             <w:rPr>
               <w:shd w:val="clear" w:color="auto" w:fill="FFFFFF"/>
@@ -8394,6 +8477,7 @@
             </w:rPr>
             <w:t xml:space="preserve">For example, to view required properties for the </w:t>
           </w:r>
+          <w:proofErr w:type="spellStart"/>
           <w:r>
             <w:rPr>
               <w:bCs/>
@@ -8403,6 +8487,7 @@
             </w:rPr>
             <w:t>studentSchoolAssociations</w:t>
           </w:r>
+          <w:proofErr w:type="spellEnd"/>
           <w:r>
             <w:rPr>
               <w:bCs/>
@@ -8428,7 +8513,47 @@
               <w:szCs w:val="20"/>
               <w:shd w:val="clear" w:color="auto" w:fill="F0F0F0"/>
             </w:rPr>
-            <w:t>POST /ed-fi/studentSchoolAssociations:</w:t>
+            <w:t>POST /</w:t>
+          </w:r>
+          <w:proofErr w:type="spellStart"/>
+          <w:r>
+            <w:rPr>
+              <w:rFonts w:ascii="Courier New" w:hAnsi="Courier New" w:cs="Courier New"/>
+              <w:sz w:val="20"/>
+              <w:szCs w:val="20"/>
+              <w:shd w:val="clear" w:color="auto" w:fill="F0F0F0"/>
+            </w:rPr>
+            <w:t>ed-fi</w:t>
+          </w:r>
+          <w:proofErr w:type="spellEnd"/>
+          <w:r>
+            <w:rPr>
+              <w:rFonts w:ascii="Courier New" w:hAnsi="Courier New" w:cs="Courier New"/>
+              <w:sz w:val="20"/>
+              <w:szCs w:val="20"/>
+              <w:shd w:val="clear" w:color="auto" w:fill="F0F0F0"/>
+            </w:rPr>
+            <w:t>/</w:t>
+          </w:r>
+          <w:proofErr w:type="spellStart"/>
+          <w:r>
+            <w:rPr>
+              <w:rFonts w:ascii="Courier New" w:hAnsi="Courier New" w:cs="Courier New"/>
+              <w:sz w:val="20"/>
+              <w:szCs w:val="20"/>
+              <w:shd w:val="clear" w:color="auto" w:fill="F0F0F0"/>
+            </w:rPr>
+            <w:t>studentSchoolAssociations</w:t>
+          </w:r>
+          <w:proofErr w:type="spellEnd"/>
+          <w:r>
+            <w:rPr>
+              <w:rFonts w:ascii="Courier New" w:hAnsi="Courier New" w:cs="Courier New"/>
+              <w:sz w:val="20"/>
+              <w:szCs w:val="20"/>
+              <w:shd w:val="clear" w:color="auto" w:fill="F0F0F0"/>
+            </w:rPr>
+            <w:t>:</w:t>
           </w:r>
           <w:r>
             <w:rPr>
@@ -8456,7 +8581,21 @@
             <w:rPr>
               <w:szCs w:val="20"/>
             </w:rPr>
-            <w:t> "ed-fi" in the path above indicates that this is a core resource.</w:t>
+            <w:t> "</w:t>
+          </w:r>
+          <w:proofErr w:type="spellStart"/>
+          <w:r>
+            <w:rPr>
+              <w:szCs w:val="20"/>
+            </w:rPr>
+            <w:t>ed-fi</w:t>
+          </w:r>
+          <w:proofErr w:type="spellEnd"/>
+          <w:r>
+            <w:rPr>
+              <w:szCs w:val="20"/>
+            </w:rPr>
+            <w:t>" in the path above indicates that this is a core resource.</w:t>
           </w:r>
         </w:p>
         <w:p>
@@ -8471,7 +8610,6 @@
               <w:noProof/>
               <w:szCs w:val="20"/>
             </w:rPr>
-            <w:lastRenderedPageBreak/>
             <mc:AlternateContent>
               <mc:Choice Requires="wpg">
                 <w:drawing>
@@ -8672,7 +8810,7 @@
                         <pic:cNvPicPr/>
                       </pic:nvPicPr>
                       <pic:blipFill rotWithShape="1">
-                        <a:blip r:embed="rId22"/>
+                        <a:blip r:embed="rId20"/>
                         <a:srcRect t="20907"/>
                         <a:stretch/>
                       </pic:blipFill>
@@ -8738,6 +8876,7 @@
             <w:rPr>
               <w:noProof/>
             </w:rPr>
+            <w:lastRenderedPageBreak/>
             <mc:AlternateContent>
               <mc:Choice Requires="wpg">
                 <w:drawing>
@@ -8926,7 +9065,7 @@
                         <pic:cNvPicPr/>
                       </pic:nvPicPr>
                       <pic:blipFill rotWithShape="1">
-                        <a:blip r:embed="rId23"/>
+                        <a:blip r:embed="rId21"/>
                         <a:srcRect t="15850"/>
                         <a:stretch/>
                       </pic:blipFill>
@@ -9181,7 +9320,7 @@
                         <pic:cNvPicPr/>
                       </pic:nvPicPr>
                       <pic:blipFill>
-                        <a:blip r:embed="rId24"/>
+                        <a:blip r:embed="rId22"/>
                         <a:stretch>
                           <a:fillRect/>
                         </a:stretch>
@@ -9225,7 +9364,6 @@
               <w:noProof/>
               <w:lang w:val="es-ES"/>
             </w:rPr>
-            <w:lastRenderedPageBreak/>
             <mc:AlternateContent>
               <mc:Choice Requires="wpg">
                 <w:drawing>
@@ -9414,7 +9552,7 @@
                         <pic:cNvPicPr/>
                       </pic:nvPicPr>
                       <pic:blipFill>
-                        <a:blip r:embed="rId25"/>
+                        <a:blip r:embed="rId23"/>
                         <a:stretch>
                           <a:fillRect/>
                         </a:stretch>
@@ -9465,6 +9603,7 @@
             </w:rPr>
             <w:t xml:space="preserve">.  For example, compare the Swagger resource property sample below for a </w:t>
           </w:r>
+          <w:proofErr w:type="spellStart"/>
           <w:r>
             <w:rPr>
               <w:i/>
@@ -9473,6 +9612,7 @@
             </w:rPr>
             <w:t>localEducationAgencyId</w:t>
           </w:r>
+          <w:proofErr w:type="spellEnd"/>
           <w:r>
             <w:rPr>
               <w:szCs w:val="20"/>
@@ -9573,7 +9713,28 @@
               <w:sz w:val="20"/>
               <w:szCs w:val="20"/>
             </w:rPr>
-            <w:t>"residentLocalEducationAgencyReference"</w:t>
+            <w:t>"</w:t>
+          </w:r>
+          <w:proofErr w:type="spellStart"/>
+          <w:r>
+            <w:rPr>
+              <w:rFonts w:ascii="Consolas" w:hAnsi="Consolas" w:cs="Courier New"/>
+              <w:color w:val="183691"/>
+              <w:sz w:val="20"/>
+              <w:szCs w:val="20"/>
+            </w:rPr>
+            <w:t>residentLocalEducationAgencyReference</w:t>
+          </w:r>
+          <w:proofErr w:type="spellEnd"/>
+          <w:proofErr w:type="gramStart"/>
+          <w:r>
+            <w:rPr>
+              <w:rFonts w:ascii="Consolas" w:hAnsi="Consolas" w:cs="Courier New"/>
+              <w:color w:val="183691"/>
+              <w:sz w:val="20"/>
+              <w:szCs w:val="20"/>
+            </w:rPr>
+            <w:t>"</w:t>
           </w:r>
           <w:r>
             <w:rPr>
@@ -9593,6 +9754,7 @@
             </w:rPr>
             <w:t xml:space="preserve"> {</w:t>
           </w:r>
+          <w:proofErr w:type="gramEnd"/>
         </w:p>
         <w:p>
           <w:pPr>
@@ -9640,7 +9802,27 @@
               <w:sz w:val="20"/>
               <w:szCs w:val="20"/>
             </w:rPr>
-            <w:t>"localEducationAgencyId"</w:t>
+            <w:t>"</w:t>
+          </w:r>
+          <w:proofErr w:type="spellStart"/>
+          <w:r>
+            <w:rPr>
+              <w:rFonts w:ascii="Consolas" w:hAnsi="Consolas" w:cs="Courier New"/>
+              <w:color w:val="183691"/>
+              <w:sz w:val="20"/>
+              <w:szCs w:val="20"/>
+            </w:rPr>
+            <w:t>localEducationAgencyId</w:t>
+          </w:r>
+          <w:proofErr w:type="spellEnd"/>
+          <w:r>
+            <w:rPr>
+              <w:rFonts w:ascii="Consolas" w:hAnsi="Consolas" w:cs="Courier New"/>
+              <w:color w:val="183691"/>
+              <w:sz w:val="20"/>
+              <w:szCs w:val="20"/>
+            </w:rPr>
+            <w:t>"</w:t>
           </w:r>
           <w:r>
             <w:rPr>
@@ -9736,6 +9918,7 @@
             </w:rPr>
             <w:t>link</w:t>
           </w:r>
+          <w:proofErr w:type="gramStart"/>
           <w:r>
             <w:rPr>
               <w:rFonts w:ascii="Consolas" w:hAnsi="Consolas" w:cs="Courier New"/>
@@ -9763,6 +9946,7 @@
             </w:rPr>
             <w:t xml:space="preserve"> {</w:t>
           </w:r>
+          <w:proofErr w:type="gramEnd"/>
         </w:p>
         <w:p>
           <w:pPr>
@@ -9822,6 +10006,7 @@
             </w:rPr>
             <w:t>"</w:t>
           </w:r>
+          <w:proofErr w:type="spellStart"/>
           <w:r>
             <w:rPr>
               <w:rFonts w:ascii="Consolas" w:hAnsi="Consolas" w:cs="Courier New"/>
@@ -9831,6 +10016,7 @@
             </w:rPr>
             <w:t>rel</w:t>
           </w:r>
+          <w:proofErr w:type="spellEnd"/>
           <w:r>
             <w:rPr>
               <w:rFonts w:ascii="Consolas" w:hAnsi="Consolas" w:cs="Courier New"/>
@@ -9926,6 +10112,7 @@
             </w:rPr>
             <w:t>"</w:t>
           </w:r>
+          <w:proofErr w:type="spellStart"/>
           <w:r>
             <w:rPr>
               <w:rFonts w:ascii="Consolas" w:hAnsi="Consolas" w:cs="Courier New"/>
@@ -9935,6 +10122,7 @@
             </w:rPr>
             <w:t>href</w:t>
           </w:r>
+          <w:proofErr w:type="spellEnd"/>
           <w:r>
             <w:rPr>
               <w:rFonts w:ascii="Consolas" w:hAnsi="Consolas" w:cs="Courier New"/>
@@ -10150,7 +10338,28 @@
               <w:sz w:val="20"/>
               <w:szCs w:val="20"/>
             </w:rPr>
-            <w:t>"residentLocalEducationAgencyReference"</w:t>
+            <w:t>"</w:t>
+          </w:r>
+          <w:proofErr w:type="spellStart"/>
+          <w:r>
+            <w:rPr>
+              <w:rFonts w:ascii="Consolas" w:hAnsi="Consolas" w:cs="Courier New"/>
+              <w:color w:val="183691"/>
+              <w:sz w:val="20"/>
+              <w:szCs w:val="20"/>
+            </w:rPr>
+            <w:t>residentLocalEducationAgencyReference</w:t>
+          </w:r>
+          <w:proofErr w:type="spellEnd"/>
+          <w:proofErr w:type="gramStart"/>
+          <w:r>
+            <w:rPr>
+              <w:rFonts w:ascii="Consolas" w:hAnsi="Consolas" w:cs="Courier New"/>
+              <w:color w:val="183691"/>
+              <w:sz w:val="20"/>
+              <w:szCs w:val="20"/>
+            </w:rPr>
+            <w:t>"</w:t>
           </w:r>
           <w:r>
             <w:rPr>
@@ -10170,6 +10379,7 @@
             </w:rPr>
             <w:t xml:space="preserve"> {</w:t>
           </w:r>
+          <w:proofErr w:type="gramEnd"/>
         </w:p>
         <w:p>
           <w:pPr>
@@ -10217,7 +10427,27 @@
               <w:sz w:val="20"/>
               <w:szCs w:val="20"/>
             </w:rPr>
-            <w:t>"localEducationAgencyId"</w:t>
+            <w:t>"</w:t>
+          </w:r>
+          <w:proofErr w:type="spellStart"/>
+          <w:r>
+            <w:rPr>
+              <w:rFonts w:ascii="Consolas" w:hAnsi="Consolas" w:cs="Courier New"/>
+              <w:color w:val="183691"/>
+              <w:sz w:val="20"/>
+              <w:szCs w:val="20"/>
+            </w:rPr>
+            <w:t>localEducationAgencyId</w:t>
+          </w:r>
+          <w:proofErr w:type="spellEnd"/>
+          <w:r>
+            <w:rPr>
+              <w:rFonts w:ascii="Consolas" w:hAnsi="Consolas" w:cs="Courier New"/>
+              <w:color w:val="183691"/>
+              <w:sz w:val="20"/>
+              <w:szCs w:val="20"/>
+            </w:rPr>
+            <w:t>"</w:t>
           </w:r>
           <w:r>
             <w:rPr>
@@ -10294,7 +10524,7 @@
               <w:shd w:val="clear" w:color="auto" w:fill="FFFFFF"/>
             </w:rPr>
           </w:pPr>
-          <w:bookmarkStart w:id="31" w:name="_Toc206603687"/>
+          <w:bookmarkStart w:id="31" w:name="_Toc235007027"/>
           <w:r>
             <w:rPr>
               <w:shd w:val="clear" w:color="auto" w:fill="FFFFFF"/>
@@ -10366,7 +10596,7 @@
             </w:rPr>
             <w:t xml:space="preserve"> </w:t>
           </w:r>
-          <w:hyperlink r:id="rId26" w:history="1">
+          <w:hyperlink r:id="rId24" w:history="1">
             <w:r>
               <w:rPr>
                 <w:rStyle w:val="Hyperlink"/>
@@ -10410,7 +10640,7 @@
           <w:pPr>
             <w:pStyle w:val="Heading3"/>
           </w:pPr>
-          <w:bookmarkStart w:id="32" w:name="_Toc206603688"/>
+          <w:bookmarkStart w:id="32" w:name="_Toc235007028"/>
           <w:r>
             <w:t>Ed-Fi Descriptor References</w:t>
           </w:r>
@@ -10429,55 +10659,80 @@
             </w:rPr>
             <w:t xml:space="preserve">See </w:t>
           </w:r>
-          <w:hyperlink r:id="rId27" w:history="1">
+          <w:hyperlink r:id="rId25" w:history="1">
             <w:r>
               <w:rPr>
                 <w:rStyle w:val="Hyperlink"/>
                 <w:szCs w:val="20"/>
               </w:rPr>
-              <w:t>MDE’s Ed-Fi Documentation GitHub site</w:t>
-            </w:r>
-          </w:hyperlink>
-          <w:r>
-            <w:rPr>
-              <w:szCs w:val="20"/>
-            </w:rPr>
-            <w:t xml:space="preserve"> for the list of </w:t>
-          </w:r>
-          <w:hyperlink r:id="rId28" w:history="1">
+              <w:t xml:space="preserve">MDE’s Ed-Fi </w:t>
+            </w:r>
             <w:r>
               <w:rPr>
                 <w:rStyle w:val="Hyperlink"/>
                 <w:szCs w:val="20"/>
               </w:rPr>
-              <w:t>MDE Ed-Fi API Descriptor Tables</w:t>
-            </w:r>
-          </w:hyperlink>
-          <w:r>
-            <w:rPr>
-              <w:szCs w:val="20"/>
-            </w:rPr>
-            <w:t xml:space="preserve"> and additional documentation on </w:t>
-          </w:r>
-          <w:hyperlink r:id="rId29" w:history="1">
+              <w:t>API Descrip</w:t>
+            </w:r>
             <w:r>
               <w:rPr>
                 <w:rStyle w:val="Hyperlink"/>
                 <w:szCs w:val="20"/>
               </w:rPr>
-              <w:t>Descriptors and Resources</w:t>
+              <w:t>t</w:t>
+            </w:r>
+            <w:r>
+              <w:rPr>
+                <w:rStyle w:val="Hyperlink"/>
+                <w:szCs w:val="20"/>
+              </w:rPr>
+              <w:t>or Tables</w:t>
             </w:r>
           </w:hyperlink>
           <w:r>
             <w:rPr>
               <w:szCs w:val="20"/>
             </w:rPr>
-            <w:t>. In the Ed-Fi Swagger Tool, you can access the descriptor list by selecting “Descriptors” from the Ed-Fi API Profiles Selector.</w:t>
-          </w:r>
-        </w:p>
-        <w:p>
-          <w:r>
-            <w:t xml:space="preserve">MDE’s custom descriptor codes have been loaded under the namespace "uri://education.mn.gov/”. However, MDE does also use some default Ed-Fi descriptor codes with the namespace “uri://ed-fi.org/”.  Check the </w:t>
+            <w:t xml:space="preserve"> website</w:t>
+          </w:r>
+          <w:r>
+            <w:rPr>
+              <w:szCs w:val="20"/>
+            </w:rPr>
+            <w:t xml:space="preserve"> for the list of</w:t>
+          </w:r>
+          <w:r>
+            <w:rPr>
+              <w:szCs w:val="20"/>
+            </w:rPr>
+            <w:t xml:space="preserve"> descriptors supported by MDE’s Ed-Fi API for the current school year. </w:t>
+          </w:r>
+          <w:r>
+            <w:rPr>
+              <w:szCs w:val="20"/>
+            </w:rPr>
+            <w:t>In the Ed-Fi Swagger Tool, you can access the descriptor list by selecting “Descriptors” from the Ed-Fi API Profiles Selector.</w:t>
+          </w:r>
+        </w:p>
+        <w:p>
+          <w:r>
+            <w:t>MDE’s custom descriptor codes have been loaded under the namespace "</w:t>
+          </w:r>
+          <w:proofErr w:type="spellStart"/>
+          <w:r>
+            <w:t>uri</w:t>
+          </w:r>
+          <w:proofErr w:type="spellEnd"/>
+          <w:r>
+            <w:t>://education.mn.gov/”. However, MDE does also use some default Ed-Fi descriptor codes with the namespace “</w:t>
+          </w:r>
+          <w:proofErr w:type="spellStart"/>
+          <w:r>
+            <w:t>uri</w:t>
+          </w:r>
+          <w:proofErr w:type="spellEnd"/>
+          <w:r>
+            <w:t xml:space="preserve">://ed-fi.org/”.  Check the </w:t>
           </w:r>
           <w:r>
             <w:t>d</w:t>
@@ -10543,7 +10798,25 @@
               <w:sz w:val="20"/>
               <w:szCs w:val="20"/>
             </w:rPr>
-            <w:t xml:space="preserve">uri://[organization indicator]/[name of descriptor]#[code value] </w:t>
+            <w:t>uri:/</w:t>
+          </w:r>
+          <w:proofErr w:type="gramStart"/>
+          <w:r>
+            <w:rPr>
+              <w:rFonts w:ascii="Courier New" w:hAnsi="Courier New" w:cs="Courier New"/>
+              <w:sz w:val="20"/>
+              <w:szCs w:val="20"/>
+            </w:rPr>
+            <w:t>/[</w:t>
+          </w:r>
+          <w:proofErr w:type="gramEnd"/>
+          <w:r>
+            <w:rPr>
+              <w:rFonts w:ascii="Courier New" w:hAnsi="Courier New" w:cs="Courier New"/>
+              <w:sz w:val="20"/>
+              <w:szCs w:val="20"/>
+            </w:rPr>
+            <w:t xml:space="preserve">organization indicator]/[name of descriptor]#[code value] </w:t>
           </w:r>
         </w:p>
         <w:p>
@@ -10563,7 +10836,21 @@
             <w:rPr>
               <w:szCs w:val="20"/>
             </w:rPr>
-            <w:t>, below is a reference to the “Special Education” code value for the ProgramType descriptor</w:t>
+            <w:t xml:space="preserve">, below is a reference to the “Special Education” code value for the </w:t>
+          </w:r>
+          <w:proofErr w:type="spellStart"/>
+          <w:r>
+            <w:rPr>
+              <w:szCs w:val="20"/>
+            </w:rPr>
+            <w:t>ProgramType</w:t>
+          </w:r>
+          <w:proofErr w:type="spellEnd"/>
+          <w:r>
+            <w:rPr>
+              <w:szCs w:val="20"/>
+            </w:rPr>
+            <w:t xml:space="preserve"> descriptor</w:t>
           </w:r>
           <w:r>
             <w:rPr>
@@ -10619,6 +10906,7 @@
             <w:lastRenderedPageBreak/>
             <w:t xml:space="preserve">The following JSON excerpt is from the Minnesota extension of the </w:t>
           </w:r>
+          <w:proofErr w:type="spellStart"/>
           <w:r>
             <w:rPr>
               <w:i/>
@@ -10627,12 +10915,14 @@
             </w:rPr>
             <w:t>studentSchoolAssociations</w:t>
           </w:r>
+          <w:proofErr w:type="spellEnd"/>
           <w:r>
             <w:rPr>
               <w:szCs w:val="20"/>
             </w:rPr>
             <w:t xml:space="preserve"> resource.  Note the usage of the </w:t>
           </w:r>
+          <w:proofErr w:type="spellStart"/>
           <w:r>
             <w:rPr>
               <w:i/>
@@ -10641,12 +10931,14 @@
             </w:rPr>
             <w:t>membershipAttendanceUnitDescriptor</w:t>
           </w:r>
+          <w:proofErr w:type="spellEnd"/>
           <w:r>
             <w:rPr>
               <w:szCs w:val="20"/>
             </w:rPr>
             <w:t xml:space="preserve"> and the </w:t>
           </w:r>
+          <w:proofErr w:type="spellStart"/>
           <w:r>
             <w:rPr>
               <w:i/>
@@ -10655,6 +10947,7 @@
             </w:rPr>
             <w:t>transportationCategoryDescriptor</w:t>
           </w:r>
+          <w:proofErr w:type="spellEnd"/>
           <w:r>
             <w:rPr>
               <w:szCs w:val="20"/>
@@ -10699,7 +10992,28 @@
               <w:sz w:val="20"/>
               <w:szCs w:val="20"/>
             </w:rPr>
-            <w:t>"_ext"</w:t>
+            <w:t>"_</w:t>
+          </w:r>
+          <w:proofErr w:type="spellStart"/>
+          <w:r>
+            <w:rPr>
+              <w:rFonts w:ascii="Consolas" w:hAnsi="Consolas" w:cs="Courier New"/>
+              <w:color w:val="183691"/>
+              <w:sz w:val="20"/>
+              <w:szCs w:val="20"/>
+            </w:rPr>
+            <w:t>ext</w:t>
+          </w:r>
+          <w:proofErr w:type="spellEnd"/>
+          <w:proofErr w:type="gramStart"/>
+          <w:r>
+            <w:rPr>
+              <w:rFonts w:ascii="Consolas" w:hAnsi="Consolas" w:cs="Courier New"/>
+              <w:color w:val="183691"/>
+              <w:sz w:val="20"/>
+              <w:szCs w:val="20"/>
+            </w:rPr>
+            <w:t>"</w:t>
           </w:r>
           <w:r>
             <w:rPr>
@@ -10719,6 +11033,7 @@
             </w:rPr>
             <w:t xml:space="preserve"> {</w:t>
           </w:r>
+          <w:proofErr w:type="gramEnd"/>
         </w:p>
         <w:p>
           <w:pPr>
@@ -10766,7 +11081,17 @@
               <w:sz w:val="20"/>
               <w:szCs w:val="20"/>
             </w:rPr>
-            <w:t>"MN"</w:t>
+            <w:t>"MN</w:t>
+          </w:r>
+          <w:proofErr w:type="gramStart"/>
+          <w:r>
+            <w:rPr>
+              <w:rFonts w:ascii="Consolas" w:hAnsi="Consolas" w:cs="Courier New"/>
+              <w:color w:val="183691"/>
+              <w:sz w:val="20"/>
+              <w:szCs w:val="20"/>
+            </w:rPr>
+            <w:t>"</w:t>
           </w:r>
           <w:r>
             <w:rPr>
@@ -10786,6 +11111,7 @@
             </w:rPr>
             <w:t xml:space="preserve"> {</w:t>
           </w:r>
+          <w:proofErr w:type="gramEnd"/>
         </w:p>
         <w:p>
           <w:pPr>
@@ -10833,7 +11159,27 @@
               <w:sz w:val="20"/>
               <w:szCs w:val="20"/>
             </w:rPr>
-            <w:t>"homeboundServiceIndicator"</w:t>
+            <w:t>"</w:t>
+          </w:r>
+          <w:proofErr w:type="spellStart"/>
+          <w:r>
+            <w:rPr>
+              <w:rFonts w:ascii="Consolas" w:hAnsi="Consolas" w:cs="Courier New"/>
+              <w:color w:val="183691"/>
+              <w:sz w:val="20"/>
+              <w:szCs w:val="20"/>
+            </w:rPr>
+            <w:t>homeboundServiceIndicator</w:t>
+          </w:r>
+          <w:proofErr w:type="spellEnd"/>
+          <w:r>
+            <w:rPr>
+              <w:rFonts w:ascii="Consolas" w:hAnsi="Consolas" w:cs="Courier New"/>
+              <w:color w:val="183691"/>
+              <w:sz w:val="20"/>
+              <w:szCs w:val="20"/>
+            </w:rPr>
+            <w:t>"</w:t>
           </w:r>
           <w:r>
             <w:rPr>
@@ -10918,7 +11264,27 @@
               <w:sz w:val="20"/>
               <w:szCs w:val="20"/>
             </w:rPr>
-            <w:t>"specialPupilIndicator"</w:t>
+            <w:t>"</w:t>
+          </w:r>
+          <w:proofErr w:type="spellStart"/>
+          <w:r>
+            <w:rPr>
+              <w:rFonts w:ascii="Consolas" w:hAnsi="Consolas" w:cs="Courier New"/>
+              <w:color w:val="183691"/>
+              <w:sz w:val="20"/>
+              <w:szCs w:val="20"/>
+            </w:rPr>
+            <w:t>specialPupilIndicator</w:t>
+          </w:r>
+          <w:proofErr w:type="spellEnd"/>
+          <w:r>
+            <w:rPr>
+              <w:rFonts w:ascii="Consolas" w:hAnsi="Consolas" w:cs="Courier New"/>
+              <w:color w:val="183691"/>
+              <w:sz w:val="20"/>
+              <w:szCs w:val="20"/>
+            </w:rPr>
+            <w:t>"</w:t>
           </w:r>
           <w:r>
             <w:rPr>
@@ -11003,7 +11369,28 @@
               <w:sz w:val="20"/>
               <w:szCs w:val="20"/>
             </w:rPr>
-            <w:t>"residentLocalEducationAgencyReference"</w:t>
+            <w:t>"</w:t>
+          </w:r>
+          <w:proofErr w:type="spellStart"/>
+          <w:r>
+            <w:rPr>
+              <w:rFonts w:ascii="Consolas" w:hAnsi="Consolas" w:cs="Courier New"/>
+              <w:color w:val="183691"/>
+              <w:sz w:val="20"/>
+              <w:szCs w:val="20"/>
+            </w:rPr>
+            <w:t>residentLocalEducationAgencyReference</w:t>
+          </w:r>
+          <w:proofErr w:type="spellEnd"/>
+          <w:proofErr w:type="gramStart"/>
+          <w:r>
+            <w:rPr>
+              <w:rFonts w:ascii="Consolas" w:hAnsi="Consolas" w:cs="Courier New"/>
+              <w:color w:val="183691"/>
+              <w:sz w:val="20"/>
+              <w:szCs w:val="20"/>
+            </w:rPr>
+            <w:t>"</w:t>
           </w:r>
           <w:r>
             <w:rPr>
@@ -11023,6 +11410,7 @@
             </w:rPr>
             <w:t xml:space="preserve"> {</w:t>
           </w:r>
+          <w:proofErr w:type="gramEnd"/>
         </w:p>
         <w:p>
           <w:pPr>
@@ -11070,7 +11458,27 @@
               <w:sz w:val="20"/>
               <w:szCs w:val="20"/>
             </w:rPr>
-            <w:t>"localEducationAgencyId"</w:t>
+            <w:t>"</w:t>
+          </w:r>
+          <w:proofErr w:type="spellStart"/>
+          <w:r>
+            <w:rPr>
+              <w:rFonts w:ascii="Consolas" w:hAnsi="Consolas" w:cs="Courier New"/>
+              <w:color w:val="183691"/>
+              <w:sz w:val="20"/>
+              <w:szCs w:val="20"/>
+            </w:rPr>
+            <w:t>localEducationAgencyId</w:t>
+          </w:r>
+          <w:proofErr w:type="spellEnd"/>
+          <w:r>
+            <w:rPr>
+              <w:rFonts w:ascii="Consolas" w:hAnsi="Consolas" w:cs="Courier New"/>
+              <w:color w:val="183691"/>
+              <w:sz w:val="20"/>
+              <w:szCs w:val="20"/>
+            </w:rPr>
+            <w:t>"</w:t>
           </w:r>
           <w:r>
             <w:rPr>
@@ -11186,7 +11594,17 @@
               <w:sz w:val="20"/>
               <w:szCs w:val="20"/>
             </w:rPr>
-            <w:t>"membership"</w:t>
+            <w:t>"membership</w:t>
+          </w:r>
+          <w:proofErr w:type="gramStart"/>
+          <w:r>
+            <w:rPr>
+              <w:rFonts w:ascii="Consolas" w:hAnsi="Consolas" w:cs="Courier New"/>
+              <w:color w:val="183691"/>
+              <w:sz w:val="20"/>
+              <w:szCs w:val="20"/>
+            </w:rPr>
+            <w:t>"</w:t>
           </w:r>
           <w:r>
             <w:rPr>
@@ -11206,6 +11624,7 @@
             </w:rPr>
             <w:t xml:space="preserve"> {</w:t>
           </w:r>
+          <w:proofErr w:type="gramEnd"/>
         </w:p>
         <w:p>
           <w:pPr>
@@ -11253,7 +11672,27 @@
               <w:sz w:val="20"/>
               <w:szCs w:val="20"/>
             </w:rPr>
-            <w:t>"membershipAttendanceUnitDescriptor"</w:t>
+            <w:t>"</w:t>
+          </w:r>
+          <w:proofErr w:type="spellStart"/>
+          <w:r>
+            <w:rPr>
+              <w:rFonts w:ascii="Consolas" w:hAnsi="Consolas" w:cs="Courier New"/>
+              <w:color w:val="183691"/>
+              <w:sz w:val="20"/>
+              <w:szCs w:val="20"/>
+            </w:rPr>
+            <w:t>membershipAttendanceUnitDescriptor</w:t>
+          </w:r>
+          <w:proofErr w:type="spellEnd"/>
+          <w:r>
+            <w:rPr>
+              <w:rFonts w:ascii="Consolas" w:hAnsi="Consolas" w:cs="Courier New"/>
+              <w:color w:val="183691"/>
+              <w:sz w:val="20"/>
+              <w:szCs w:val="20"/>
+            </w:rPr>
+            <w:t>"</w:t>
           </w:r>
           <w:r>
             <w:rPr>
@@ -11508,7 +11947,27 @@
               <w:sz w:val="20"/>
               <w:szCs w:val="20"/>
             </w:rPr>
-            <w:t>"percentEnrolled"</w:t>
+            <w:t>"</w:t>
+          </w:r>
+          <w:proofErr w:type="spellStart"/>
+          <w:r>
+            <w:rPr>
+              <w:rFonts w:ascii="Consolas" w:hAnsi="Consolas" w:cs="Courier New"/>
+              <w:color w:val="183691"/>
+              <w:sz w:val="20"/>
+              <w:szCs w:val="20"/>
+            </w:rPr>
+            <w:t>percentEnrolled</w:t>
+          </w:r>
+          <w:proofErr w:type="spellEnd"/>
+          <w:r>
+            <w:rPr>
+              <w:rFonts w:ascii="Consolas" w:hAnsi="Consolas" w:cs="Courier New"/>
+              <w:color w:val="183691"/>
+              <w:sz w:val="20"/>
+              <w:szCs w:val="20"/>
+            </w:rPr>
+            <w:t>"</w:t>
           </w:r>
           <w:r>
             <w:rPr>
@@ -11624,7 +12083,17 @@
               <w:sz w:val="20"/>
               <w:szCs w:val="20"/>
             </w:rPr>
-            <w:t>"transportation"</w:t>
+            <w:t>"transportation</w:t>
+          </w:r>
+          <w:proofErr w:type="gramStart"/>
+          <w:r>
+            <w:rPr>
+              <w:rFonts w:ascii="Consolas" w:hAnsi="Consolas" w:cs="Courier New"/>
+              <w:color w:val="183691"/>
+              <w:sz w:val="20"/>
+              <w:szCs w:val="20"/>
+            </w:rPr>
+            <w:t>"</w:t>
           </w:r>
           <w:r>
             <w:rPr>
@@ -11644,6 +12113,7 @@
             </w:rPr>
             <w:t xml:space="preserve"> {</w:t>
           </w:r>
+          <w:proofErr w:type="gramEnd"/>
         </w:p>
         <w:p>
           <w:pPr>
@@ -11691,7 +12161,27 @@
               <w:sz w:val="20"/>
               <w:szCs w:val="20"/>
             </w:rPr>
-            <w:t>"transportationCategoryDescriptor"</w:t>
+            <w:t>"</w:t>
+          </w:r>
+          <w:proofErr w:type="spellStart"/>
+          <w:r>
+            <w:rPr>
+              <w:rFonts w:ascii="Consolas" w:hAnsi="Consolas" w:cs="Courier New"/>
+              <w:color w:val="183691"/>
+              <w:sz w:val="20"/>
+              <w:szCs w:val="20"/>
+            </w:rPr>
+            <w:t>transportationCategoryDescriptor</w:t>
+          </w:r>
+          <w:proofErr w:type="spellEnd"/>
+          <w:r>
+            <w:rPr>
+              <w:rFonts w:ascii="Consolas" w:hAnsi="Consolas" w:cs="Courier New"/>
+              <w:color w:val="183691"/>
+              <w:sz w:val="20"/>
+              <w:szCs w:val="20"/>
+            </w:rPr>
+            <w:t>"</w:t>
           </w:r>
           <w:r>
             <w:rPr>
@@ -11718,7 +12208,27 @@
               <w:sz w:val="20"/>
               <w:szCs w:val="20"/>
             </w:rPr>
-            <w:t>"uri://education.mn.gov/TransportationCategoryDescriptor#01"</w:t>
+            <w:t>"</w:t>
+          </w:r>
+          <w:proofErr w:type="spellStart"/>
+          <w:r>
+            <w:rPr>
+              <w:rFonts w:ascii="Consolas" w:hAnsi="Consolas" w:cs="Courier New"/>
+              <w:color w:val="183691"/>
+              <w:sz w:val="20"/>
+              <w:szCs w:val="20"/>
+            </w:rPr>
+            <w:t>uri</w:t>
+          </w:r>
+          <w:proofErr w:type="spellEnd"/>
+          <w:r>
+            <w:rPr>
+              <w:rFonts w:ascii="Consolas" w:hAnsi="Consolas" w:cs="Courier New"/>
+              <w:color w:val="183691"/>
+              <w:sz w:val="20"/>
+              <w:szCs w:val="20"/>
+            </w:rPr>
+            <w:t>://education.mn.gov/TransportationCategoryDescriptor#01"</w:t>
           </w:r>
           <w:r>
             <w:rPr>
@@ -11776,7 +12286,28 @@
               <w:sz w:val="20"/>
               <w:szCs w:val="20"/>
             </w:rPr>
-            <w:t>"transportingLocalEducationAgencyReference"</w:t>
+            <w:t>"</w:t>
+          </w:r>
+          <w:proofErr w:type="spellStart"/>
+          <w:r>
+            <w:rPr>
+              <w:rFonts w:ascii="Consolas" w:hAnsi="Consolas" w:cs="Courier New"/>
+              <w:color w:val="183691"/>
+              <w:sz w:val="20"/>
+              <w:szCs w:val="20"/>
+            </w:rPr>
+            <w:t>transportingLocalEducationAgencyReference</w:t>
+          </w:r>
+          <w:proofErr w:type="spellEnd"/>
+          <w:proofErr w:type="gramStart"/>
+          <w:r>
+            <w:rPr>
+              <w:rFonts w:ascii="Consolas" w:hAnsi="Consolas" w:cs="Courier New"/>
+              <w:color w:val="183691"/>
+              <w:sz w:val="20"/>
+              <w:szCs w:val="20"/>
+            </w:rPr>
+            <w:t>"</w:t>
           </w:r>
           <w:r>
             <w:rPr>
@@ -11796,6 +12327,7 @@
             </w:rPr>
             <w:t xml:space="preserve"> {</w:t>
           </w:r>
+          <w:proofErr w:type="gramEnd"/>
         </w:p>
         <w:p>
           <w:pPr>
@@ -11843,7 +12375,27 @@
               <w:sz w:val="20"/>
               <w:szCs w:val="20"/>
             </w:rPr>
-            <w:t>"localEducationAgencyId"</w:t>
+            <w:t>"</w:t>
+          </w:r>
+          <w:proofErr w:type="spellStart"/>
+          <w:r>
+            <w:rPr>
+              <w:rFonts w:ascii="Consolas" w:hAnsi="Consolas" w:cs="Courier New"/>
+              <w:color w:val="183691"/>
+              <w:sz w:val="20"/>
+              <w:szCs w:val="20"/>
+            </w:rPr>
+            <w:t>localEducationAgencyId</w:t>
+          </w:r>
+          <w:proofErr w:type="spellEnd"/>
+          <w:r>
+            <w:rPr>
+              <w:rFonts w:ascii="Consolas" w:hAnsi="Consolas" w:cs="Courier New"/>
+              <w:color w:val="183691"/>
+              <w:sz w:val="20"/>
+              <w:szCs w:val="20"/>
+            </w:rPr>
+            <w:t>"</w:t>
           </w:r>
           <w:r>
             <w:rPr>
@@ -12037,7 +12589,7 @@
           <w:pPr>
             <w:pStyle w:val="Heading3"/>
           </w:pPr>
-          <w:bookmarkStart w:id="33" w:name="_Toc206603689"/>
+          <w:bookmarkStart w:id="33" w:name="_Toc235007029"/>
           <w:r>
             <w:t>MDE Identifiers</w:t>
           </w:r>
@@ -12117,9 +12669,11 @@
                 <w:tcW w:w="2691" w:type="dxa"/>
               </w:tcPr>
               <w:p>
+                <w:proofErr w:type="spellStart"/>
                 <w:r>
                   <w:t>StudentUniqueId</w:t>
                 </w:r>
+                <w:proofErr w:type="spellEnd"/>
               </w:p>
             </w:tc>
             <w:tc>
@@ -12149,7 +12703,7 @@
                 <w:r>
                   <w:t xml:space="preserve">See </w:t>
                 </w:r>
-                <w:hyperlink r:id="rId30" w:anchor="ed-fi--marss-identities-api-integrations" w:history="1">
+                <w:hyperlink r:id="rId26" w:anchor="ed-fi--marss-identities-api-integrations" w:history="1">
                   <w:r>
                     <w:rPr>
                       <w:rStyle w:val="Hyperlink"/>
@@ -12173,9 +12727,43 @@
                 <w:tcW w:w="2691" w:type="dxa"/>
               </w:tcPr>
               <w:p>
+                <w:proofErr w:type="spellStart"/>
                 <w:r>
-                  <w:t>EducationOrganizationId, LocalEducationAgencyId, SchoolId, PostSecondaryInstitutionId, StateEducationAgencyId</w:t>
+                  <w:t>EducationOrganizationId</w:t>
                 </w:r>
+                <w:proofErr w:type="spellEnd"/>
+                <w:r>
+                  <w:t xml:space="preserve">, </w:t>
+                </w:r>
+                <w:proofErr w:type="spellStart"/>
+                <w:r>
+                  <w:t>LocalEducationAgencyId</w:t>
+                </w:r>
+                <w:proofErr w:type="spellEnd"/>
+                <w:r>
+                  <w:t xml:space="preserve">, </w:t>
+                </w:r>
+                <w:proofErr w:type="spellStart"/>
+                <w:r>
+                  <w:t>SchoolId</w:t>
+                </w:r>
+                <w:proofErr w:type="spellEnd"/>
+                <w:r>
+                  <w:t xml:space="preserve">, </w:t>
+                </w:r>
+                <w:proofErr w:type="spellStart"/>
+                <w:r>
+                  <w:t>PostSecondaryInstitutionId</w:t>
+                </w:r>
+                <w:proofErr w:type="spellEnd"/>
+                <w:r>
+                  <w:t xml:space="preserve">, </w:t>
+                </w:r>
+                <w:proofErr w:type="spellStart"/>
+                <w:r>
+                  <w:t>StateEducationAgencyId</w:t>
+                </w:r>
+                <w:proofErr w:type="spellEnd"/>
               </w:p>
             </w:tc>
             <w:tc>
@@ -12196,7 +12784,7 @@
                 <w:r>
                   <w:t xml:space="preserve">See </w:t>
                 </w:r>
-                <w:hyperlink r:id="rId31" w:history="1">
+                <w:hyperlink r:id="rId27" w:history="1">
                   <w:r>
                     <w:rPr>
                       <w:rStyle w:val="Hyperlink"/>
@@ -12210,7 +12798,7 @@
                 <w:r>
                   <w:t xml:space="preserve">documentation on </w:t>
                 </w:r>
-                <w:hyperlink r:id="rId32" w:anchor="minnesota-district-and-school-ids" w:history="1">
+                <w:hyperlink r:id="rId28" w:anchor="minnesota-district-and-school-ids" w:history="1">
                   <w:r>
                     <w:rPr>
                       <w:rStyle w:val="Hyperlink"/>
@@ -12226,7 +12814,7 @@
                 <w:r>
                   <w:t xml:space="preserve">More information is available in </w:t>
                 </w:r>
-                <w:hyperlink r:id="rId33" w:history="1">
+                <w:hyperlink r:id="rId29" w:history="1">
                   <w:r>
                     <w:rPr>
                       <w:rStyle w:val="Hyperlink"/>
@@ -12237,7 +12825,7 @@
                 <w:r>
                   <w:t xml:space="preserve">, including this reference on </w:t>
                 </w:r>
-                <w:hyperlink r:id="rId34" w:history="1">
+                <w:hyperlink r:id="rId30" w:history="1">
                   <w:r>
                     <w:rPr>
                       <w:rStyle w:val="Hyperlink"/>
@@ -12261,10 +12849,12 @@
                 <w:tcW w:w="2691" w:type="dxa"/>
               </w:tcPr>
               <w:p>
+                <w:proofErr w:type="spellStart"/>
                 <w:r>
                   <w:lastRenderedPageBreak/>
                   <w:t>StaffUniqueId</w:t>
                 </w:r>
+                <w:proofErr w:type="spellEnd"/>
               </w:p>
             </w:tc>
             <w:tc>
@@ -12298,7 +12888,7 @@
             </w:rPr>
             <w:t xml:space="preserve">See </w:t>
           </w:r>
-          <w:hyperlink r:id="rId35" w:history="1">
+          <w:hyperlink r:id="rId31" w:history="1">
             <w:r>
               <w:rPr>
                 <w:rStyle w:val="Hyperlink"/>
@@ -12319,88 +12909,97 @@
             </w:rPr>
             <w:t xml:space="preserve"> MDE Ed-Fi API requirements for </w:t>
           </w:r>
-          <w:hyperlink r:id="rId36" w:anchor="education-organization-id-usage-by-resource" w:history="1">
+          <w:hyperlink r:id="rId32" w:anchor="education-organization-id-usage-by-resource" w:history="1">
+            <w:proofErr w:type="spellStart"/>
             <w:r>
               <w:rPr>
                 <w:rStyle w:val="Hyperlink"/>
                 <w:szCs w:val="20"/>
               </w:rPr>
-              <w:t>EducationOrganizationId Usage by Resource</w:t>
-            </w:r>
-          </w:hyperlink>
-          <w:r>
-            <w:rPr>
-              <w:szCs w:val="20"/>
-            </w:rPr>
-            <w:t>.</w:t>
-          </w:r>
-        </w:p>
-        <w:p>
-          <w:pPr>
-            <w:pStyle w:val="Heading3"/>
-          </w:pPr>
-          <w:bookmarkStart w:id="34" w:name="_Toc206603690"/>
-          <w:r>
-            <w:t>Ed-Fi Model Dependency</w:t>
-          </w:r>
-          <w:bookmarkEnd w:id="34"/>
-        </w:p>
-        <w:p>
-          <w:pPr>
-            <w:rPr>
-              <w:szCs w:val="20"/>
-            </w:rPr>
-          </w:pPr>
-          <w:r>
-            <w:rPr>
-              <w:szCs w:val="20"/>
-            </w:rPr>
-            <w:t>Ed-Fi uses a data-dependency security model that enforces the order of creation when inserting various records via the API. This is often encountered via API errors such as the following:</w:t>
-          </w:r>
-        </w:p>
-        <w:p>
-          <w:pPr>
-            <w:rPr>
-              <w:i/>
-              <w:szCs w:val="20"/>
-            </w:rPr>
-          </w:pPr>
-          <w:r>
-            <w:rPr>
-              <w:i/>
-              <w:szCs w:val="20"/>
-            </w:rPr>
-            <w:t>Authorization denied. The claim does not have any established relationships with the requested resource.</w:t>
-          </w:r>
-        </w:p>
-        <w:p>
-          <w:r>
-            <w:rPr>
-              <w:szCs w:val="20"/>
-            </w:rPr>
-            <w:t xml:space="preserve">See </w:t>
-          </w:r>
-          <w:hyperlink r:id="rId37" w:history="1">
+              <w:t>EducationOrganizationId</w:t>
+            </w:r>
+            <w:proofErr w:type="spellEnd"/>
             <w:r>
               <w:rPr>
                 <w:rStyle w:val="Hyperlink"/>
                 <w:szCs w:val="20"/>
               </w:rPr>
-              <w:t>MDE’s Ed-Fi Documentation GitHub site</w:t>
+              <w:t xml:space="preserve"> Usage by Resource</w:t>
             </w:r>
           </w:hyperlink>
           <w:r>
             <w:rPr>
               <w:szCs w:val="20"/>
             </w:rPr>
-            <w:t xml:space="preserve"> for </w:t>
-          </w:r>
-          <w:hyperlink r:id="rId38" w:anchor="ed-fi-model-dependency" w:history="1">
+            <w:t>.</w:t>
+          </w:r>
+        </w:p>
+        <w:p>
+          <w:pPr>
+            <w:pStyle w:val="Heading3"/>
+          </w:pPr>
+          <w:bookmarkStart w:id="34" w:name="_Toc235007030"/>
+          <w:r>
+            <w:t>Ed-Fi Model Dependency</w:t>
+          </w:r>
+          <w:bookmarkEnd w:id="34"/>
+        </w:p>
+        <w:p>
+          <w:pPr>
+            <w:rPr>
+              <w:szCs w:val="20"/>
+            </w:rPr>
+          </w:pPr>
+          <w:r>
+            <w:rPr>
+              <w:szCs w:val="20"/>
+            </w:rPr>
+            <w:t>Ed-Fi uses a data-dependency security model that enforces the order of creation when inserting various records via the API. This is often encountered via API errors such as the following:</w:t>
+          </w:r>
+        </w:p>
+        <w:p>
+          <w:pPr>
+            <w:rPr>
+              <w:i/>
+              <w:szCs w:val="20"/>
+            </w:rPr>
+          </w:pPr>
+          <w:r>
+            <w:rPr>
+              <w:i/>
+              <w:szCs w:val="20"/>
+            </w:rPr>
+            <w:t>Authorization denied. The claim does not have any established relationships with the requested resource.</w:t>
+          </w:r>
+        </w:p>
+        <w:p>
+          <w:r>
+            <w:rPr>
+              <w:szCs w:val="20"/>
+            </w:rPr>
+            <w:t xml:space="preserve">See </w:t>
+          </w:r>
+          <w:hyperlink r:id="rId33" w:history="1">
             <w:r>
               <w:rPr>
                 <w:rStyle w:val="Hyperlink"/>
                 <w:szCs w:val="20"/>
               </w:rPr>
+              <w:t>MDE’s Ed-Fi Documentation GitHub site</w:t>
+            </w:r>
+          </w:hyperlink>
+          <w:r>
+            <w:rPr>
+              <w:szCs w:val="20"/>
+            </w:rPr>
+            <w:t xml:space="preserve"> for </w:t>
+          </w:r>
+          <w:hyperlink r:id="rId34" w:anchor="ed-fi-model-dependency" w:history="1">
+            <w:r>
+              <w:rPr>
+                <w:rStyle w:val="Hyperlink"/>
+                <w:szCs w:val="20"/>
+              </w:rPr>
               <w:t>Ed-Fi Model Dependency Graphs</w:t>
             </w:r>
           </w:hyperlink>
@@ -12415,7 +13014,7 @@
           <w:pPr>
             <w:pStyle w:val="Heading3"/>
           </w:pPr>
-          <w:bookmarkStart w:id="35" w:name="_Toc206603691"/>
+          <w:bookmarkStart w:id="35" w:name="_Toc235007031"/>
           <w:r>
             <w:t>Read-Only Ed-Fi API Endpoints</w:t>
           </w:r>
@@ -12463,11 +13062,24 @@
           <w:pPr>
             <w:pStyle w:val="Heading4"/>
           </w:pPr>
-          <w:bookmarkStart w:id="36" w:name="_Toc206603692"/>
-          <w:r>
-            <w:t>Resource: /ed-fi/localEducationAgencies</w:t>
+          <w:bookmarkStart w:id="36" w:name="_Toc235007032"/>
+          <w:r>
+            <w:t>Resource: /</w:t>
+          </w:r>
+          <w:proofErr w:type="spellStart"/>
+          <w:r>
+            <w:t>ed-fi</w:t>
+          </w:r>
+          <w:proofErr w:type="spellEnd"/>
+          <w:r>
+            <w:t>/</w:t>
+          </w:r>
+          <w:proofErr w:type="spellStart"/>
+          <w:r>
+            <w:t>localEducationAgencies</w:t>
           </w:r>
           <w:bookmarkEnd w:id="36"/>
+          <w:proofErr w:type="spellEnd"/>
         </w:p>
         <w:p>
           <w:pPr>
@@ -12494,9 +13106,17 @@
           <w:pPr>
             <w:pStyle w:val="Heading4"/>
           </w:pPr>
-          <w:bookmarkStart w:id="37" w:name="_Toc206603693"/>
-          <w:r>
-            <w:t>Resource: /ed-fi/schools</w:t>
+          <w:bookmarkStart w:id="37" w:name="_Toc235007033"/>
+          <w:r>
+            <w:t>Resource: /</w:t>
+          </w:r>
+          <w:proofErr w:type="spellStart"/>
+          <w:r>
+            <w:t>ed-fi</w:t>
+          </w:r>
+          <w:proofErr w:type="spellEnd"/>
+          <w:r>
+            <w:t>/schools</w:t>
           </w:r>
           <w:bookmarkEnd w:id="37"/>
         </w:p>
@@ -12525,11 +13145,24 @@
           <w:pPr>
             <w:pStyle w:val="Heading4"/>
           </w:pPr>
-          <w:bookmarkStart w:id="38" w:name="_Toc206603694"/>
-          <w:r>
-            <w:t>Resource: /ed-fi/postSecondaryInstitutions</w:t>
+          <w:bookmarkStart w:id="38" w:name="_Toc235007034"/>
+          <w:r>
+            <w:t>Resource: /</w:t>
+          </w:r>
+          <w:proofErr w:type="spellStart"/>
+          <w:r>
+            <w:t>ed-fi</w:t>
+          </w:r>
+          <w:proofErr w:type="spellEnd"/>
+          <w:r>
+            <w:t>/</w:t>
+          </w:r>
+          <w:proofErr w:type="spellStart"/>
+          <w:r>
+            <w:t>postSecondaryInstitutions</w:t>
           </w:r>
           <w:bookmarkEnd w:id="38"/>
+          <w:proofErr w:type="spellEnd"/>
         </w:p>
         <w:p>
           <w:pPr>
@@ -12557,9 +13190,17 @@
           <w:pPr>
             <w:pStyle w:val="Heading4"/>
           </w:pPr>
-          <w:bookmarkStart w:id="39" w:name="_Toc206603695"/>
-          <w:r>
-            <w:t>Resource: /ed-fi/programs</w:t>
+          <w:bookmarkStart w:id="39" w:name="_Toc235007035"/>
+          <w:r>
+            <w:t>Resource: /</w:t>
+          </w:r>
+          <w:proofErr w:type="spellStart"/>
+          <w:r>
+            <w:t>ed-fi</w:t>
+          </w:r>
+          <w:proofErr w:type="spellEnd"/>
+          <w:r>
+            <w:t>/programs</w:t>
           </w:r>
           <w:bookmarkEnd w:id="39"/>
         </w:p>
@@ -12615,9 +13256,17 @@
           <w:pPr>
             <w:pStyle w:val="Heading4"/>
           </w:pPr>
-          <w:bookmarkStart w:id="40" w:name="_Toc206603696"/>
-          <w:r>
-            <w:t>Resource: /ed-fi/courses</w:t>
+          <w:bookmarkStart w:id="40" w:name="_Toc235007036"/>
+          <w:r>
+            <w:t>Resource: /</w:t>
+          </w:r>
+          <w:proofErr w:type="spellStart"/>
+          <w:r>
+            <w:t>ed-fi</w:t>
+          </w:r>
+          <w:proofErr w:type="spellEnd"/>
+          <w:r>
+            <w:t>/courses</w:t>
           </w:r>
           <w:bookmarkEnd w:id="40"/>
         </w:p>
@@ -12639,16 +13288,38 @@
             <w:rPr>
               <w:szCs w:val="20"/>
             </w:rPr>
-            <w:t>The MCCC State Course Catalog courses are loaded for the state education agency (EducationOrganizationId = 999999000) into the ODS by MDE.</w:t>
+            <w:t>The MCCC State Course Catalog courses are loaded for the state education agency (</w:t>
+          </w:r>
+          <w:proofErr w:type="spellStart"/>
+          <w:r>
+            <w:rPr>
+              <w:szCs w:val="20"/>
+            </w:rPr>
+            <w:t>EducationOrganizationId</w:t>
+          </w:r>
+          <w:proofErr w:type="spellEnd"/>
+          <w:r>
+            <w:rPr>
+              <w:szCs w:val="20"/>
+            </w:rPr>
+            <w:t xml:space="preserve"> = 999999000) into the ODS by MDE.</w:t>
           </w:r>
         </w:p>
         <w:p>
           <w:pPr>
             <w:pStyle w:val="Heading4"/>
           </w:pPr>
-          <w:bookmarkStart w:id="41" w:name="_Toc206603697"/>
-          <w:r>
-            <w:t>Resource: /ed-fi/staffs</w:t>
+          <w:bookmarkStart w:id="41" w:name="_Toc235007037"/>
+          <w:r>
+            <w:t>Resource: /</w:t>
+          </w:r>
+          <w:proofErr w:type="spellStart"/>
+          <w:r>
+            <w:t>ed-fi</w:t>
+          </w:r>
+          <w:proofErr w:type="spellEnd"/>
+          <w:r>
+            <w:t>/staffs</w:t>
           </w:r>
           <w:bookmarkEnd w:id="41"/>
         </w:p>
@@ -12657,20 +13328,42 @@
             <w:pStyle w:val="Quote"/>
           </w:pPr>
           <w:r>
-            <w:t xml:space="preserve">This entity represents an individual who performs specified activities for any public or private education institution or agency that provides instructional and/or support services to students or staff at the early childhood level through high school completion. </w:t>
-          </w:r>
-        </w:p>
-        <w:p>
-          <w:pPr>
-            <w:rPr>
-              <w:szCs w:val="20"/>
-            </w:rPr>
-          </w:pPr>
-          <w:r>
-            <w:rPr>
-              <w:szCs w:val="20"/>
-            </w:rPr>
-            <w:t>Licensed educator records are loaded from the Educator Licensing system into the ODS by MDE for referencing in MCCC staffSectionAssociations.</w:t>
+            <w:t xml:space="preserve">This entity represents an individual who performs specified activities for any public or private education institution or agency that provides instructional and/or support services to students or staff at </w:t>
+          </w:r>
+          <w:proofErr w:type="gramStart"/>
+          <w:r>
+            <w:t>the</w:t>
+          </w:r>
+          <w:proofErr w:type="gramEnd"/>
+          <w:r>
+            <w:t xml:space="preserve"> early childhood level through high school completion. </w:t>
+          </w:r>
+        </w:p>
+        <w:p>
+          <w:pPr>
+            <w:rPr>
+              <w:szCs w:val="20"/>
+            </w:rPr>
+          </w:pPr>
+          <w:r>
+            <w:rPr>
+              <w:szCs w:val="20"/>
+            </w:rPr>
+            <w:t xml:space="preserve">Licensed educator records are loaded from the Educator Licensing system into the ODS by MDE for referencing in MCCC </w:t>
+          </w:r>
+          <w:proofErr w:type="spellStart"/>
+          <w:r>
+            <w:rPr>
+              <w:szCs w:val="20"/>
+            </w:rPr>
+            <w:t>staffSectionAssociations</w:t>
+          </w:r>
+          <w:proofErr w:type="spellEnd"/>
+          <w:r>
+            <w:rPr>
+              <w:szCs w:val="20"/>
+            </w:rPr>
+            <w:t>.</w:t>
           </w:r>
         </w:p>
         <w:p>
@@ -12683,8 +13376,8 @@
       </w:sdtContent>
     </w:sdt>
     <w:sectPr>
-      <w:footerReference w:type="default" r:id="rId39"/>
-      <w:footerReference w:type="first" r:id="rId40"/>
+      <w:footerReference w:type="default" r:id="rId35"/>
+      <w:footerReference w:type="first" r:id="rId36"/>
       <w:type w:val="continuous"/>
       <w:pgSz w:w="12240" w:h="15840" w:code="1"/>
       <w:pgMar w:top="1440" w:right="1080" w:bottom="1440" w:left="1080" w:header="0" w:footer="504" w:gutter="0"/>
@@ -12846,7 +13539,7 @@
         <v:path o:extrusionok="f" gradientshapeok="t" o:connecttype="rect"/>
         <o:lock v:ext="edit" aspectratio="t"/>
       </v:shapetype>
-      <v:shape id="_x0000_i1044" type="#_x0000_t75" style="width:12.75pt;height:24.75pt" o:bullet="t">
+      <v:shape id="_x0000_i1038" type="#_x0000_t75" style="width:12.9pt;height:24.7pt" o:bullet="t">
         <v:imagedata r:id="rId1" o:title="Art_Bullet_Green-Svc-Descr"/>
       </v:shape>
     </w:pict>

</xml_diff>